<commit_message>
Add newsletter signup to footer on all 18 pages
Compact email-only form with DSGVO checkbox in dark footer,
submits to HubSpot newsletter form via API.

Co-Authored-By: Claude Opus 4.6 <noreply@anthropic.com>
</commit_message>
<xml_diff>
--- a/Workbook-Struktur-Komplett.docx
+++ b/Workbook-Struktur-Komplett.docx
@@ -44,7 +44,7 @@
           <w:sz w:val="30"/>
           <w:szCs w:val="30"/>
         </w:rPr>
-        <w:t xml:space="preserve">Dein Business Workspace in unter einer Woche mit KI</w:t>
+        <w:t xml:space="preserve">Dein Business Workspace in unter einer Woche mit KI selbst erstellt</w:t>
       </w:r>
     </w:p>
     <w:p>
@@ -72,7 +72,7 @@
           <w:sz w:val="22"/>
           <w:szCs w:val="22"/>
         </w:rPr>
-        <w:t xml:space="preserve">So macht Selbstständigkeit wieder Spaß.</w:t>
+        <w:t xml:space="preserve">1:1 so, wie ich meinen eigenen Workspace aufgebaut habe.</w:t>
       </w:r>
     </w:p>
     <w:p>
@@ -100,30 +100,38 @@
     </w:p>
     <w:p>
       <w:pPr>
-        <w:spacing w:after="80"/>
-      </w:pPr>
-      <w:r>
-        <w:rPr>
-          <w:rFonts w:ascii="Arial" w:cs="Arial" w:eastAsia="Arial" w:hAnsi="Arial"/>
-          <w:b/>
-          <w:bCs/>
+        <w:spacing w:after="100"/>
+      </w:pPr>
+      <w:r>
+        <w:rPr>
+          <w:rFonts w:ascii="Arial" w:cs="Arial" w:eastAsia="Arial" w:hAnsi="Arial"/>
+          <w:b/>
+          <w:bCs/>
+          <w:color w:val="E8604C"/>
           <w:sz w:val="20"/>
           <w:szCs w:val="20"/>
         </w:rPr>
-        <w:t xml:space="preserve">Das bekommst du:</w:t>
-      </w:r>
-    </w:p>
-    <w:p>
-      <w:pPr>
-        <w:spacing w:after="60"/>
-      </w:pPr>
-      <w:r>
-        <w:rPr>
-          <w:rFonts w:ascii="Arial" w:cs="Arial" w:eastAsia="Arial" w:hAnsi="Arial"/>
+        <w:t xml:space="preserve">120+ Seiten · Schritt-für-Schritt · Alle Prompts inklusive</w:t>
+      </w:r>
+    </w:p>
+    <w:p>
+      <w:pPr>
+        <w:spacing w:after="200"/>
+      </w:pPr>
+    </w:p>
+    <w:p>
+      <w:pPr>
+        <w:spacing w:after="80"/>
+      </w:pPr>
+      <w:r>
+        <w:rPr>
+          <w:rFonts w:ascii="Arial" w:cs="Arial" w:eastAsia="Arial" w:hAnsi="Arial"/>
+          <w:b/>
+          <w:bCs/>
           <w:sz w:val="20"/>
           <w:szCs w:val="20"/>
         </w:rPr>
-        <w:t xml:space="preserve">✓  Fertige Website · live im Internet</w:t>
+        <w:t xml:space="preserve">Das bekommst du:</w:t>
       </w:r>
     </w:p>
     <w:p>
@@ -136,7 +144,7 @@
           <w:sz w:val="20"/>
           <w:szCs w:val="20"/>
         </w:rPr>
-        <w:t xml:space="preserve">✓  Eigene Domain</w:t>
+        <w:t xml:space="preserve">✓  Fertige Website · live im Internet</w:t>
       </w:r>
     </w:p>
     <w:p>
@@ -149,7 +157,7 @@
           <w:sz w:val="20"/>
           <w:szCs w:val="20"/>
         </w:rPr>
-        <w:t xml:space="preserve">✓  Geschäftliche E-Mail (Google Workspace)</w:t>
+        <w:t xml:space="preserve">✓  Eigene Domain</w:t>
       </w:r>
     </w:p>
     <w:p>
@@ -162,7 +170,7 @@
           <w:sz w:val="20"/>
           <w:szCs w:val="20"/>
         </w:rPr>
-        <w:t xml:space="preserve">✓  Logo &amp; Branding (Canva)</w:t>
+        <w:t xml:space="preserve">✓  Geschäftliche E-Mail (Google Workspace)</w:t>
       </w:r>
     </w:p>
     <w:p>
@@ -175,7 +183,7 @@
           <w:sz w:val="20"/>
           <w:szCs w:val="20"/>
         </w:rPr>
-        <w:t xml:space="preserve">✓  CRM-System (HubSpot)</w:t>
+        <w:t xml:space="preserve">✓  Logo &amp; Branding (Canva)</w:t>
       </w:r>
     </w:p>
     <w:p>
@@ -188,7 +196,7 @@
           <w:sz w:val="20"/>
           <w:szCs w:val="20"/>
         </w:rPr>
-        <w:t xml:space="preserve">✓  Impressum, Datenschutz &amp; Cookie-Banner</w:t>
+        <w:t xml:space="preserve">✓  CRM-System (HubSpot)</w:t>
       </w:r>
     </w:p>
     <w:p>
@@ -201,7 +209,7 @@
           <w:sz w:val="20"/>
           <w:szCs w:val="20"/>
         </w:rPr>
-        <w:t xml:space="preserve">✓  Automatisierung mit KI</w:t>
+        <w:t xml:space="preserve">✓  Impressum, Datenschutz &amp; Cookie-Banner</w:t>
       </w:r>
     </w:p>
     <w:p>
@@ -214,6 +222,19 @@
           <w:sz w:val="20"/>
           <w:szCs w:val="20"/>
         </w:rPr>
+        <w:t xml:space="preserve">✓  Automatisierung mit KI</w:t>
+      </w:r>
+    </w:p>
+    <w:p>
+      <w:pPr>
+        <w:spacing w:after="60"/>
+      </w:pPr>
+      <w:r>
+        <w:rPr>
+          <w:rFonts w:ascii="Arial" w:cs="Arial" w:eastAsia="Arial" w:hAnsi="Arial"/>
+          <w:sz w:val="20"/>
+          <w:szCs w:val="20"/>
+        </w:rPr>
         <w:t xml:space="preserve">✓  Digitale Produkte verkaufen (Stripe)</w:t>
       </w:r>
     </w:p>
@@ -266,6 +287,58 @@
           <w:szCs w:val="22"/>
         </w:rPr>
         <w:t xml:space="preserve">Baeumler Marketing</w:t>
+      </w:r>
+    </w:p>
+    <w:p>
+      <w:pPr>
+        <w:spacing w:after="200"/>
+      </w:pPr>
+    </w:p>
+    <w:p>
+      <w:pPr>
+        <w:pBdr>
+          <w:top w:val="single" w:color="E8604C" w:sz="1"/>
+        </w:pBdr>
+        <w:spacing w:after="60" w:before="200"/>
+      </w:pPr>
+    </w:p>
+    <w:p>
+      <w:pPr>
+        <w:spacing w:after="60"/>
+      </w:pPr>
+      <w:r>
+        <w:rPr>
+          <w:rFonts w:ascii="Arial" w:cs="Arial" w:eastAsia="Arial" w:hAnsi="Arial"/>
+          <w:b/>
+          <w:bCs/>
+          <w:color w:val="E8604C"/>
+          <w:sz w:val="20"/>
+          <w:szCs w:val="20"/>
+        </w:rPr>
+        <w:t xml:space="preserve">P.S. </w:t>
+      </w:r>
+      <w:r>
+        <w:rPr>
+          <w:rFonts w:ascii="Arial" w:cs="Arial" w:eastAsia="Arial" w:hAnsi="Arial"/>
+          <w:sz w:val="20"/>
+          <w:szCs w:val="20"/>
+        </w:rPr>
+        <w:t xml:space="preserve">Für 89€ hast du dir gerade zwischen 5.000 und 15.000€ gespart.</w:t>
+      </w:r>
+    </w:p>
+    <w:p>
+      <w:pPr>
+        <w:spacing w:after="100"/>
+      </w:pPr>
+      <w:r>
+        <w:rPr>
+          <w:rFonts w:ascii="Arial" w:cs="Arial" w:eastAsia="Arial" w:hAnsi="Arial"/>
+          <w:i/>
+          <w:iCs/>
+          <w:sz w:val="20"/>
+          <w:szCs w:val="20"/>
+        </w:rPr>
+        <w:t xml:space="preserve">Das ist weniger als eine einzige Stunde bei einer Agentur.</w:t>
       </w:r>
     </w:p>
     <w:p>
@@ -1330,70 +1403,6 @@
           <w:szCs w:val="22"/>
         </w:rPr>
         <w:t xml:space="preserve">Bevor wir irgendein Tool aufmachen, reden wir über das Wichtigste: dich. Deine Einstellung, deine Zeit und deinen Plan.</w:t>
-      </w:r>
-    </w:p>
-    <w:p>
-      <w:pPr>
-        <w:spacing w:after="200"/>
-      </w:pPr>
-    </w:p>
-    <w:p>
-      <w:pPr>
-        <w:spacing w:after="200"/>
-        <w:jc w:val="center"/>
-      </w:pPr>
-      <w:r>
-        <w:rPr>
-          <w:rFonts w:ascii="Georgia" w:cs="Georgia" w:eastAsia="Georgia" w:hAnsi="Georgia"/>
-          <w:i/>
-          <w:iCs/>
-          <w:sz w:val="22"/>
-          <w:szCs w:val="22"/>
-        </w:rPr>
-        <w:t xml:space="preserve">"Lieber heute mit 70% starten, als nächstes Jahr immer noch auf 100% warten."</w:t>
-      </w:r>
-    </w:p>
-    <w:p>
-      <w:pPr>
-        <w:jc w:val="center"/>
-      </w:pPr>
-      <w:r>
-        <w:rPr>
-          <w:color w:val="AAAAAA"/>
-          <w:sz w:val="20"/>
-          <w:szCs w:val="20"/>
-        </w:rPr>
-        <w:t xml:space="preserve">[Foto / Bild Platzhalter]</w:t>
-      </w:r>
-    </w:p>
-    <w:p>
-      <w:r>
-        <w:br w:type="page"/>
-      </w:r>
-    </w:p>
-    <w:p>
-      <w:pPr>
-        <w:pStyle w:val="Heading3"/>
-      </w:pPr>
-      <w:r>
-        <w:rPr>
-          <w:b/>
-          <w:bCs/>
-        </w:rPr>
-        <w:t xml:space="preserve">01 — Unternehmer-Mindset</w:t>
-      </w:r>
-    </w:p>
-    <w:p>
-      <w:pPr>
-        <w:spacing w:after="120"/>
-      </w:pPr>
-      <w:r>
-        <w:rPr>
-          <w:rFonts w:ascii="Arial" w:cs="Arial" w:eastAsia="Arial" w:hAnsi="Arial"/>
-          <w:sz w:val="22"/>
-          <w:szCs w:val="22"/>
-        </w:rPr>
-        <w:t xml:space="preserve">Was mir in der Schule nie beigebracht wurde, wird heute wichtiger denn je: zu wissen, wie man sich selbstständig macht und ein eigenes Business aufbaut.</w:t>
       </w:r>
     </w:p>
     <w:p>
@@ -1407,6 +1416,70 @@
           <w:docGrid w:linePitch="360"/>
         </w:sectPr>
       </w:pPr>
+    </w:p>
+    <w:p>
+      <w:pPr>
+        <w:spacing w:after="200"/>
+      </w:pPr>
+    </w:p>
+    <w:p>
+      <w:pPr>
+        <w:spacing w:after="200"/>
+        <w:jc w:val="center"/>
+      </w:pPr>
+      <w:r>
+        <w:rPr>
+          <w:rFonts w:ascii="Georgia" w:cs="Georgia" w:eastAsia="Georgia" w:hAnsi="Georgia"/>
+          <w:i/>
+          <w:iCs/>
+          <w:sz w:val="22"/>
+          <w:szCs w:val="22"/>
+        </w:rPr>
+        <w:t xml:space="preserve">"Lieber heute mit 70% starten, als nächstes Jahr immer noch auf 100% warten."</w:t>
+      </w:r>
+    </w:p>
+    <w:p>
+      <w:pPr>
+        <w:jc w:val="center"/>
+      </w:pPr>
+      <w:r>
+        <w:rPr>
+          <w:color w:val="AAAAAA"/>
+          <w:sz w:val="20"/>
+          <w:szCs w:val="20"/>
+        </w:rPr>
+        <w:t xml:space="preserve">[Foto / Bild Platzhalter]</w:t>
+      </w:r>
+    </w:p>
+    <w:p>
+      <w:r>
+        <w:br w:type="page"/>
+      </w:r>
+    </w:p>
+    <w:p>
+      <w:pPr>
+        <w:pStyle w:val="Heading3"/>
+      </w:pPr>
+      <w:r>
+        <w:rPr>
+          <w:b/>
+          <w:bCs/>
+        </w:rPr>
+        <w:t xml:space="preserve">01 — Unternehmer-Mindset</w:t>
+      </w:r>
+    </w:p>
+    <w:p>
+      <w:pPr>
+        <w:spacing w:after="120"/>
+      </w:pPr>
+      <w:r>
+        <w:rPr>
+          <w:rFonts w:ascii="Arial" w:cs="Arial" w:eastAsia="Arial" w:hAnsi="Arial"/>
+          <w:sz w:val="22"/>
+          <w:szCs w:val="22"/>
+        </w:rPr>
+        <w:t xml:space="preserve">Was mir in der Schule nie beigebracht wurde, wird heute wichtiger denn je: zu wissen, wie man sich selbstständig macht und ein eigenes Business aufbaut.</w:t>
+      </w:r>
     </w:p>
     <w:p>
       <w:pPr>
@@ -2848,6 +2921,19 @@
     </w:p>
     <w:p>
       <w:pPr>
+        <w:sectPr>
+          <w:headerReference w:type="default" r:id="rId9"/>
+          <w:footerReference w:type="default" r:id="rId10"/>
+          <w:type w:val="continuous"/>
+          <w:pgSz w:w="11906" w:h="16838" w:orient="portrait"/>
+          <w:pgMar w:top="1440" w:right="1440" w:bottom="1440" w:left="1440" w:header="708" w:footer="708" w:gutter="0"/>
+          <w:pgNumType/>
+          <w:docGrid w:linePitch="360"/>
+        </w:sectPr>
+      </w:pPr>
+    </w:p>
+    <w:p>
+      <w:pPr>
         <w:spacing w:after="120"/>
       </w:pPr>
       <w:r>
@@ -2964,19 +3050,6 @@
         </w:tc>
       </w:tr>
     </w:tbl>
-    <w:p>
-      <w:pPr>
-        <w:sectPr>
-          <w:headerReference w:type="default" r:id="rId9"/>
-          <w:footerReference w:type="default" r:id="rId10"/>
-          <w:type w:val="continuous"/>
-          <w:pgSz w:w="11906" w:h="16838" w:orient="portrait"/>
-          <w:pgMar w:top="1440" w:right="1440" w:bottom="1440" w:left="1440" w:header="708" w:footer="708" w:gutter="0"/>
-          <w:pgNumType/>
-          <w:docGrid w:linePitch="360"/>
-        </w:sectPr>
-      </w:pPr>
-    </w:p>
     <w:p>
       <w:pPr>
         <w:spacing w:after="200"/>
@@ -4952,75 +5025,6 @@
     </w:p>
     <w:p>
       <w:pPr>
-        <w:spacing w:after="120"/>
-      </w:pPr>
-      <w:r>
-        <w:rPr>
-          <w:rFonts w:ascii="Arial" w:cs="Arial" w:eastAsia="Arial" w:hAnsi="Arial"/>
-          <w:sz w:val="22"/>
-          <w:szCs w:val="22"/>
-        </w:rPr>
-        <w:t xml:space="preserve">Das war der Moment, in dem ich verstanden habe: Du musst nicht programmieren können. Du musst nur wissen, wie du mit Claude redest.</w:t>
-      </w:r>
-    </w:p>
-    <w:p>
-      <w:pPr>
-        <w:spacing w:after="120"/>
-      </w:pPr>
-      <w:r>
-        <w:rPr>
-          <w:rFonts w:ascii="Arial" w:cs="Arial" w:eastAsia="Arial" w:hAnsi="Arial"/>
-          <w:sz w:val="22"/>
-          <w:szCs w:val="22"/>
-        </w:rPr>
-        <w:t xml:space="preserve">Und genau das lernst du in diesem Kapitel. Wir fangen ganz am Anfang an — kein Vorwissen nötig. Am Ende wirst du wissen, was Claude kann, wie du es nutzt und welchen Modus du wofür brauchst. Nimm dir für dieses Kapitel ruhig etwas mehr Zeit — es ist die Grundlage für alles, was danach kommt.</w:t>
-      </w:r>
-    </w:p>
-    <w:p>
-      <w:pPr>
-        <w:spacing w:after="200"/>
-      </w:pPr>
-    </w:p>
-    <w:p>
-      <w:pPr>
-        <w:pStyle w:val="Heading3"/>
-      </w:pPr>
-      <w:r>
-        <w:rPr>
-          <w:b/>
-          <w:bCs/>
-        </w:rPr>
-        <w:t xml:space="preserve">Erstmal ankommen: Claude ausprobieren</w:t>
-      </w:r>
-    </w:p>
-    <w:p>
-      <w:pPr>
-        <w:spacing w:after="120"/>
-      </w:pPr>
-      <w:r>
-        <w:rPr>
-          <w:rFonts w:ascii="Arial" w:cs="Arial" w:eastAsia="Arial" w:hAnsi="Arial"/>
-          <w:sz w:val="22"/>
-          <w:szCs w:val="22"/>
-        </w:rPr>
-        <w:t xml:space="preserve">Bevor wir irgendetwas einrichten, solltest du Claude erstmal kennenlernen. Öffne claude.ai, melde dich an und stell einfach eine Frage. Irgendeine. Das kann sein: „Was brauche ich alles, um mich als Coach selbstständig zu machen?“ Oder: „Erkläre mir, was eine Domain ist — so, als wäre ich 10.“</w:t>
-      </w:r>
-    </w:p>
-    <w:p>
-      <w:pPr>
-        <w:spacing w:after="120"/>
-      </w:pPr>
-      <w:r>
-        <w:rPr>
-          <w:rFonts w:ascii="Arial" w:cs="Arial" w:eastAsia="Arial" w:hAnsi="Arial"/>
-          <w:sz w:val="22"/>
-          <w:szCs w:val="22"/>
-        </w:rPr>
-        <w:t xml:space="preserve">Es geht darum, ein Gefühl dafür zu bekommen, wie Claude antwortet. Wie du Fragen stellst. Und dass du merkst: Das hier ist kein kompliziertes Programm. Das ist wie chatten — nur dass dein Gesprächspartner wirklich alles weiß.</w:t>
-      </w:r>
-    </w:p>
-    <w:p>
-      <w:pPr>
         <w:sectPr>
           <w:headerReference w:type="default" r:id="rId11"/>
           <w:footerReference w:type="default" r:id="rId12"/>
@@ -5031,6 +5035,75 @@
           <w:docGrid w:linePitch="360"/>
         </w:sectPr>
       </w:pPr>
+    </w:p>
+    <w:p>
+      <w:pPr>
+        <w:spacing w:after="120"/>
+      </w:pPr>
+      <w:r>
+        <w:rPr>
+          <w:rFonts w:ascii="Arial" w:cs="Arial" w:eastAsia="Arial" w:hAnsi="Arial"/>
+          <w:sz w:val="22"/>
+          <w:szCs w:val="22"/>
+        </w:rPr>
+        <w:t xml:space="preserve">Das war der Moment, in dem ich verstanden habe: Du musst nicht programmieren können. Du musst nur wissen, wie du mit Claude redest.</w:t>
+      </w:r>
+    </w:p>
+    <w:p>
+      <w:pPr>
+        <w:spacing w:after="120"/>
+      </w:pPr>
+      <w:r>
+        <w:rPr>
+          <w:rFonts w:ascii="Arial" w:cs="Arial" w:eastAsia="Arial" w:hAnsi="Arial"/>
+          <w:sz w:val="22"/>
+          <w:szCs w:val="22"/>
+        </w:rPr>
+        <w:t xml:space="preserve">Und genau das lernst du in diesem Kapitel. Wir fangen ganz am Anfang an — kein Vorwissen nötig. Am Ende wirst du wissen, was Claude kann, wie du es nutzt und welchen Modus du wofür brauchst. Nimm dir für dieses Kapitel ruhig etwas mehr Zeit — es ist die Grundlage für alles, was danach kommt.</w:t>
+      </w:r>
+    </w:p>
+    <w:p>
+      <w:pPr>
+        <w:spacing w:after="200"/>
+      </w:pPr>
+    </w:p>
+    <w:p>
+      <w:pPr>
+        <w:pStyle w:val="Heading3"/>
+      </w:pPr>
+      <w:r>
+        <w:rPr>
+          <w:b/>
+          <w:bCs/>
+        </w:rPr>
+        <w:t xml:space="preserve">Erstmal ankommen: Claude ausprobieren</w:t>
+      </w:r>
+    </w:p>
+    <w:p>
+      <w:pPr>
+        <w:spacing w:after="120"/>
+      </w:pPr>
+      <w:r>
+        <w:rPr>
+          <w:rFonts w:ascii="Arial" w:cs="Arial" w:eastAsia="Arial" w:hAnsi="Arial"/>
+          <w:sz w:val="22"/>
+          <w:szCs w:val="22"/>
+        </w:rPr>
+        <w:t xml:space="preserve">Bevor wir irgendetwas einrichten, solltest du Claude erstmal kennenlernen. Öffne claude.ai, melde dich an und stell einfach eine Frage. Irgendeine. Das kann sein: „Was brauche ich alles, um mich als Coach selbstständig zu machen?“ Oder: „Erkläre mir, was eine Domain ist — so, als wäre ich 10.“</w:t>
+      </w:r>
+    </w:p>
+    <w:p>
+      <w:pPr>
+        <w:spacing w:after="120"/>
+      </w:pPr>
+      <w:r>
+        <w:rPr>
+          <w:rFonts w:ascii="Arial" w:cs="Arial" w:eastAsia="Arial" w:hAnsi="Arial"/>
+          <w:sz w:val="22"/>
+          <w:szCs w:val="22"/>
+        </w:rPr>
+        <w:t xml:space="preserve">Es geht darum, ein Gefühl dafür zu bekommen, wie Claude antwortet. Wie du Fragen stellst. Und dass du merkst: Das hier ist kein kompliziertes Programm. Das ist wie chatten — nur dass dein Gesprächspartner wirklich alles weiß.</w:t>
+      </w:r>
     </w:p>
     <w:p>
       <w:pPr>
@@ -6333,70 +6406,6 @@
     </w:p>
     <w:p>
       <w:pPr>
-        <w:spacing w:after="120"/>
-      </w:pPr>
-      <w:r>
-        <w:rPr>
-          <w:rFonts w:ascii="Arial" w:cs="Arial" w:eastAsia="Arial" w:hAnsi="Arial"/>
-          <w:sz w:val="22"/>
-          <w:szCs w:val="22"/>
-        </w:rPr>
-        <w:t xml:space="preserve">Jetzt kommt ein Punkt, der am Anfang vielleicht etwas abstrakt klingt, aber später extrem wichtig wird: Dein Projektordner. Lies diesen Abschnitt aufmerksam — wenn du den Projektordner einmal verstanden hast, ergibt alles andere viel mehr Sinn.</w:t>
-      </w:r>
-    </w:p>
-    <w:p>
-      <w:pPr>
-        <w:spacing w:after="200"/>
-      </w:pPr>
-    </w:p>
-    <w:p>
-      <w:pPr>
-        <w:spacing w:after="120"/>
-      </w:pPr>
-      <w:r>
-        <w:rPr>
-          <w:rFonts w:ascii="Arial" w:cs="Arial" w:eastAsia="Arial" w:hAnsi="Arial"/>
-          <w:sz w:val="22"/>
-          <w:szCs w:val="22"/>
-        </w:rPr>
-        <w:t xml:space="preserve">Stell dir deinen Projektordner vor wie einen Aktenordner auf deinem Schreibtisch — nur digital. In diesem Ordner liegen am Ende alle Dateien deiner Website: die Startseite, das Design, deine Bilder, deine Texte. Alles an einem Ort.</w:t>
-      </w:r>
-    </w:p>
-    <w:p>
-      <w:pPr>
-        <w:spacing w:after="200"/>
-      </w:pPr>
-    </w:p>
-    <w:p>
-      <w:pPr>
-        <w:spacing w:after="120"/>
-      </w:pPr>
-      <w:r>
-        <w:rPr>
-          <w:rFonts w:ascii="Arial" w:cs="Arial" w:eastAsia="Arial" w:hAnsi="Arial"/>
-          <w:b/>
-          <w:bCs/>
-          <w:sz w:val="22"/>
-          <w:szCs w:val="22"/>
-        </w:rPr>
-        <w:t xml:space="preserve">Warum ist das wichtig?</w:t>
-      </w:r>
-    </w:p>
-    <w:p>
-      <w:pPr>
-        <w:spacing w:after="120"/>
-      </w:pPr>
-      <w:r>
-        <w:rPr>
-          <w:rFonts w:ascii="Arial" w:cs="Arial" w:eastAsia="Arial" w:hAnsi="Arial"/>
-          <w:sz w:val="22"/>
-          <w:szCs w:val="22"/>
-        </w:rPr>
-        <w:t xml:space="preserve">Claude Code arbeitet direkt in diesem Ordner. Wenn du Claude sagst „Erstelle mir eine Website“, legt Claude die Dateien genau dort ab. Und wenn du deine Website später live schalten willst (Kapitel 10), lädst du genau diesen Ordner auf GitHub hoch — und von dort geht er automatisch zu Vercel, wo deine Website dann für alle sichtbar ist.</w:t>
-      </w:r>
-    </w:p>
-    <w:p>
-      <w:pPr>
         <w:sectPr>
           <w:headerReference w:type="default" r:id="rId13"/>
           <w:footerReference w:type="default" r:id="rId14"/>
@@ -6407,6 +6416,70 @@
           <w:docGrid w:linePitch="360"/>
         </w:sectPr>
       </w:pPr>
+    </w:p>
+    <w:p>
+      <w:pPr>
+        <w:spacing w:after="120"/>
+      </w:pPr>
+      <w:r>
+        <w:rPr>
+          <w:rFonts w:ascii="Arial" w:cs="Arial" w:eastAsia="Arial" w:hAnsi="Arial"/>
+          <w:sz w:val="22"/>
+          <w:szCs w:val="22"/>
+        </w:rPr>
+        <w:t xml:space="preserve">Jetzt kommt ein Punkt, der am Anfang vielleicht etwas abstrakt klingt, aber später extrem wichtig wird: Dein Projektordner. Lies diesen Abschnitt aufmerksam — wenn du den Projektordner einmal verstanden hast, ergibt alles andere viel mehr Sinn.</w:t>
+      </w:r>
+    </w:p>
+    <w:p>
+      <w:pPr>
+        <w:spacing w:after="200"/>
+      </w:pPr>
+    </w:p>
+    <w:p>
+      <w:pPr>
+        <w:spacing w:after="120"/>
+      </w:pPr>
+      <w:r>
+        <w:rPr>
+          <w:rFonts w:ascii="Arial" w:cs="Arial" w:eastAsia="Arial" w:hAnsi="Arial"/>
+          <w:sz w:val="22"/>
+          <w:szCs w:val="22"/>
+        </w:rPr>
+        <w:t xml:space="preserve">Stell dir deinen Projektordner vor wie einen Aktenordner auf deinem Schreibtisch — nur digital. In diesem Ordner liegen am Ende alle Dateien deiner Website: die Startseite, das Design, deine Bilder, deine Texte. Alles an einem Ort.</w:t>
+      </w:r>
+    </w:p>
+    <w:p>
+      <w:pPr>
+        <w:spacing w:after="200"/>
+      </w:pPr>
+    </w:p>
+    <w:p>
+      <w:pPr>
+        <w:spacing w:after="120"/>
+      </w:pPr>
+      <w:r>
+        <w:rPr>
+          <w:rFonts w:ascii="Arial" w:cs="Arial" w:eastAsia="Arial" w:hAnsi="Arial"/>
+          <w:b/>
+          <w:bCs/>
+          <w:sz w:val="22"/>
+          <w:szCs w:val="22"/>
+        </w:rPr>
+        <w:t xml:space="preserve">Warum ist das wichtig?</w:t>
+      </w:r>
+    </w:p>
+    <w:p>
+      <w:pPr>
+        <w:spacing w:after="120"/>
+      </w:pPr>
+      <w:r>
+        <w:rPr>
+          <w:rFonts w:ascii="Arial" w:cs="Arial" w:eastAsia="Arial" w:hAnsi="Arial"/>
+          <w:sz w:val="22"/>
+          <w:szCs w:val="22"/>
+        </w:rPr>
+        <w:t xml:space="preserve">Claude Code arbeitet direkt in diesem Ordner. Wenn du Claude sagst „Erstelle mir eine Website“, legt Claude die Dateien genau dort ab. Und wenn du deine Website später live schalten willst (Kapitel 10), lädst du genau diesen Ordner auf GitHub hoch — und von dort geht er automatisch zu Vercel, wo deine Website dann für alle sichtbar ist.</w:t>
+      </w:r>
     </w:p>
     <w:p>
       <w:pPr>
@@ -7674,86 +7747,6 @@
     </w:p>
     <w:p>
       <w:pPr>
-        <w:spacing w:after="120"/>
-      </w:pPr>
-      <w:r>
-        <w:rPr>
-          <w:rFonts w:ascii="Arial" w:cs="Arial" w:eastAsia="Arial" w:hAnsi="Arial"/>
-          <w:b/>
-          <w:bCs/>
-          <w:sz w:val="22"/>
-          <w:szCs w:val="22"/>
-        </w:rPr>
-        <w:t xml:space="preserve">Checkliste Kapitel 04:</w:t>
-      </w:r>
-    </w:p>
-    <w:p>
-      <w:pPr>
-        <w:spacing w:after="60"/>
-      </w:pPr>
-      <w:r>
-        <w:rPr>
-          <w:rFonts w:ascii="Arial" w:cs="Arial" w:eastAsia="Arial" w:hAnsi="Arial"/>
-          <w:sz w:val="20"/>
-          <w:szCs w:val="20"/>
-        </w:rPr>
-        <w:t xml:space="preserve">☐  Claude Free getestet und ausprobiert</w:t>
-      </w:r>
-    </w:p>
-    <w:p>
-      <w:pPr>
-        <w:spacing w:after="60"/>
-      </w:pPr>
-      <w:r>
-        <w:rPr>
-          <w:rFonts w:ascii="Arial" w:cs="Arial" w:eastAsia="Arial" w:hAnsi="Arial"/>
-          <w:sz w:val="20"/>
-          <w:szCs w:val="20"/>
-        </w:rPr>
-        <w:t xml:space="preserve">☐  Claude Pro Abo abgeschlossen (oder geplant)</w:t>
-      </w:r>
-    </w:p>
-    <w:p>
-      <w:pPr>
-        <w:spacing w:after="60"/>
-      </w:pPr>
-      <w:r>
-        <w:rPr>
-          <w:rFonts w:ascii="Arial" w:cs="Arial" w:eastAsia="Arial" w:hAnsi="Arial"/>
-          <w:sz w:val="20"/>
-          <w:szCs w:val="20"/>
-        </w:rPr>
-        <w:t xml:space="preserve">☐  Erstes Projekt angelegt mit Projektanweisung</w:t>
-      </w:r>
-    </w:p>
-    <w:p>
-      <w:pPr>
-        <w:spacing w:after="60"/>
-      </w:pPr>
-      <w:r>
-        <w:rPr>
-          <w:rFonts w:ascii="Arial" w:cs="Arial" w:eastAsia="Arial" w:hAnsi="Arial"/>
-          <w:sz w:val="20"/>
-          <w:szCs w:val="20"/>
-        </w:rPr>
-        <w:t xml:space="preserve">☐  Wissensdatenbank: Erste Dateien hochgeladen</w:t>
-      </w:r>
-    </w:p>
-    <w:p>
-      <w:pPr>
-        <w:spacing w:after="60"/>
-      </w:pPr>
-      <w:r>
-        <w:rPr>
-          <w:rFonts w:ascii="Arial" w:cs="Arial" w:eastAsia="Arial" w:hAnsi="Arial"/>
-          <w:sz w:val="20"/>
-          <w:szCs w:val="20"/>
-        </w:rPr>
-        <w:t xml:space="preserve">☐  Die drei Modi verstanden (Chat, Cowork, Code)</w:t>
-      </w:r>
-    </w:p>
-    <w:p>
-      <w:pPr>
         <w:sectPr>
           <w:headerReference w:type="default" r:id="rId15"/>
           <w:footerReference w:type="default" r:id="rId16"/>
@@ -7764,6 +7757,86 @@
           <w:docGrid w:linePitch="360"/>
         </w:sectPr>
       </w:pPr>
+    </w:p>
+    <w:p>
+      <w:pPr>
+        <w:spacing w:after="120"/>
+      </w:pPr>
+      <w:r>
+        <w:rPr>
+          <w:rFonts w:ascii="Arial" w:cs="Arial" w:eastAsia="Arial" w:hAnsi="Arial"/>
+          <w:b/>
+          <w:bCs/>
+          <w:sz w:val="22"/>
+          <w:szCs w:val="22"/>
+        </w:rPr>
+        <w:t xml:space="preserve">Checkliste Kapitel 04:</w:t>
+      </w:r>
+    </w:p>
+    <w:p>
+      <w:pPr>
+        <w:spacing w:after="60"/>
+      </w:pPr>
+      <w:r>
+        <w:rPr>
+          <w:rFonts w:ascii="Arial" w:cs="Arial" w:eastAsia="Arial" w:hAnsi="Arial"/>
+          <w:sz w:val="20"/>
+          <w:szCs w:val="20"/>
+        </w:rPr>
+        <w:t xml:space="preserve">☐  Claude Free getestet und ausprobiert</w:t>
+      </w:r>
+    </w:p>
+    <w:p>
+      <w:pPr>
+        <w:spacing w:after="60"/>
+      </w:pPr>
+      <w:r>
+        <w:rPr>
+          <w:rFonts w:ascii="Arial" w:cs="Arial" w:eastAsia="Arial" w:hAnsi="Arial"/>
+          <w:sz w:val="20"/>
+          <w:szCs w:val="20"/>
+        </w:rPr>
+        <w:t xml:space="preserve">☐  Claude Pro Abo abgeschlossen (oder geplant)</w:t>
+      </w:r>
+    </w:p>
+    <w:p>
+      <w:pPr>
+        <w:spacing w:after="60"/>
+      </w:pPr>
+      <w:r>
+        <w:rPr>
+          <w:rFonts w:ascii="Arial" w:cs="Arial" w:eastAsia="Arial" w:hAnsi="Arial"/>
+          <w:sz w:val="20"/>
+          <w:szCs w:val="20"/>
+        </w:rPr>
+        <w:t xml:space="preserve">☐  Erstes Projekt angelegt mit Projektanweisung</w:t>
+      </w:r>
+    </w:p>
+    <w:p>
+      <w:pPr>
+        <w:spacing w:after="60"/>
+      </w:pPr>
+      <w:r>
+        <w:rPr>
+          <w:rFonts w:ascii="Arial" w:cs="Arial" w:eastAsia="Arial" w:hAnsi="Arial"/>
+          <w:sz w:val="20"/>
+          <w:szCs w:val="20"/>
+        </w:rPr>
+        <w:t xml:space="preserve">☐  Wissensdatenbank: Erste Dateien hochgeladen</w:t>
+      </w:r>
+    </w:p>
+    <w:p>
+      <w:pPr>
+        <w:spacing w:after="60"/>
+      </w:pPr>
+      <w:r>
+        <w:rPr>
+          <w:rFonts w:ascii="Arial" w:cs="Arial" w:eastAsia="Arial" w:hAnsi="Arial"/>
+          <w:sz w:val="20"/>
+          <w:szCs w:val="20"/>
+        </w:rPr>
+        <w:t xml:space="preserve">☐  Die drei Modi verstanden (Chat, Cowork, Code)</w:t>
+      </w:r>
     </w:p>
     <w:p>
       <w:pPr>
@@ -8916,6 +8989,19 @@
     </w:p>
     <w:p>
       <w:pPr>
+        <w:sectPr>
+          <w:headerReference w:type="default" r:id="rId17"/>
+          <w:footerReference w:type="default" r:id="rId18"/>
+          <w:type w:val="continuous"/>
+          <w:pgSz w:w="11906" w:h="16838" w:orient="portrait"/>
+          <w:pgMar w:top="1440" w:right="1440" w:bottom="1440" w:left="1440" w:header="708" w:footer="708" w:gutter="0"/>
+          <w:pgNumType/>
+          <w:docGrid w:linePitch="360"/>
+        </w:sectPr>
+      </w:pPr>
+    </w:p>
+    <w:p>
+      <w:pPr>
         <w:spacing w:after="120"/>
       </w:pPr>
       <w:r>
@@ -9024,19 +9110,6 @@
         </w:tc>
       </w:tr>
     </w:tbl>
-    <w:p>
-      <w:pPr>
-        <w:sectPr>
-          <w:headerReference w:type="default" r:id="rId17"/>
-          <w:footerReference w:type="default" r:id="rId18"/>
-          <w:type w:val="continuous"/>
-          <w:pgSz w:w="11906" w:h="16838" w:orient="portrait"/>
-          <w:pgMar w:top="1440" w:right="1440" w:bottom="1440" w:left="1440" w:header="708" w:footer="708" w:gutter="0"/>
-          <w:pgNumType/>
-          <w:docGrid w:linePitch="360"/>
-        </w:sectPr>
-      </w:pPr>
-    </w:p>
     <w:p>
       <w:pPr>
         <w:spacing w:after="200"/>
@@ -10340,72 +10413,6 @@
     </w:p>
     <w:p>
       <w:pPr>
-        <w:spacing w:after="120"/>
-      </w:pPr>
-      <w:r>
-        <w:rPr>
-          <w:rFonts w:ascii="Arial" w:cs="Arial" w:eastAsia="Arial" w:hAnsi="Arial"/>
-          <w:b/>
-          <w:bCs/>
-          <w:sz w:val="22"/>
-          <w:szCs w:val="22"/>
-        </w:rPr>
-        <w:t xml:space="preserve">Schritt 1: Template aussuchen</w:t>
-      </w:r>
-    </w:p>
-    <w:p>
-      <w:pPr>
-        <w:spacing w:after="120"/>
-      </w:pPr>
-      <w:r>
-        <w:rPr>
-          <w:rFonts w:ascii="Arial" w:cs="Arial" w:eastAsia="Arial" w:hAnsi="Arial"/>
-          <w:sz w:val="22"/>
-          <w:szCs w:val="22"/>
-        </w:rPr>
-        <w:t xml:space="preserve">Egal welche Quelle du nutzt — such dir ein Template, das dir vom Gefühl her gefällt. Es muss nicht perfekt sein. Achte vor allem auf: Sieht es modern aus? Funktioniert es auf dem Handy? Hat es die Bereiche, die du brauchst (Hero, Über mich, Leistungen, Kontakt)?</w:t>
-      </w:r>
-    </w:p>
-    <w:p>
-      <w:pPr>
-        <w:spacing w:after="200"/>
-      </w:pPr>
-    </w:p>
-    <w:p>
-      <w:pPr>
-        <w:spacing w:after="120"/>
-      </w:pPr>
-      <w:r>
-        <w:rPr>
-          <w:rFonts w:ascii="Arial" w:cs="Arial" w:eastAsia="Arial" w:hAnsi="Arial"/>
-          <w:b/>
-          <w:bCs/>
-          <w:sz w:val="22"/>
-          <w:szCs w:val="22"/>
-        </w:rPr>
-        <w:t xml:space="preserve">Schritt 2: HTML-Dateien herunterladen oder kopieren</w:t>
-      </w:r>
-    </w:p>
-    <w:p>
-      <w:pPr>
-        <w:spacing w:after="120"/>
-      </w:pPr>
-      <w:r>
-        <w:rPr>
-          <w:rFonts w:ascii="Arial" w:cs="Arial" w:eastAsia="Arial" w:hAnsi="Arial"/>
-          <w:sz w:val="22"/>
-          <w:szCs w:val="22"/>
-        </w:rPr>
-        <w:t xml:space="preserve">Bei Template-Seiten: Lade den ZIP-Ordner herunter und entpacke ihn. Bei Quellcode kopieren: Erstelle eine index.html-Datei und füge den Code ein. Bei v0.dev: Kopiere den generierten Code in dein Projekt.</w:t>
-      </w:r>
-    </w:p>
-    <w:p>
-      <w:pPr>
-        <w:spacing w:after="200"/>
-      </w:pPr>
-    </w:p>
-    <w:p>
-      <w:pPr>
         <w:sectPr>
           <w:headerReference w:type="default" r:id="rId19"/>
           <w:footerReference w:type="default" r:id="rId20"/>
@@ -10415,6 +10422,72 @@
           <w:pgNumType/>
           <w:docGrid w:linePitch="360"/>
         </w:sectPr>
+      </w:pPr>
+    </w:p>
+    <w:p>
+      <w:pPr>
+        <w:spacing w:after="120"/>
+      </w:pPr>
+      <w:r>
+        <w:rPr>
+          <w:rFonts w:ascii="Arial" w:cs="Arial" w:eastAsia="Arial" w:hAnsi="Arial"/>
+          <w:b/>
+          <w:bCs/>
+          <w:sz w:val="22"/>
+          <w:szCs w:val="22"/>
+        </w:rPr>
+        <w:t xml:space="preserve">Schritt 1: Template aussuchen</w:t>
+      </w:r>
+    </w:p>
+    <w:p>
+      <w:pPr>
+        <w:spacing w:after="120"/>
+      </w:pPr>
+      <w:r>
+        <w:rPr>
+          <w:rFonts w:ascii="Arial" w:cs="Arial" w:eastAsia="Arial" w:hAnsi="Arial"/>
+          <w:sz w:val="22"/>
+          <w:szCs w:val="22"/>
+        </w:rPr>
+        <w:t xml:space="preserve">Egal welche Quelle du nutzt — such dir ein Template, das dir vom Gefühl her gefällt. Es muss nicht perfekt sein. Achte vor allem auf: Sieht es modern aus? Funktioniert es auf dem Handy? Hat es die Bereiche, die du brauchst (Hero, Über mich, Leistungen, Kontakt)?</w:t>
+      </w:r>
+    </w:p>
+    <w:p>
+      <w:pPr>
+        <w:spacing w:after="200"/>
+      </w:pPr>
+    </w:p>
+    <w:p>
+      <w:pPr>
+        <w:spacing w:after="120"/>
+      </w:pPr>
+      <w:r>
+        <w:rPr>
+          <w:rFonts w:ascii="Arial" w:cs="Arial" w:eastAsia="Arial" w:hAnsi="Arial"/>
+          <w:b/>
+          <w:bCs/>
+          <w:sz w:val="22"/>
+          <w:szCs w:val="22"/>
+        </w:rPr>
+        <w:t xml:space="preserve">Schritt 2: HTML-Dateien herunterladen oder kopieren</w:t>
+      </w:r>
+    </w:p>
+    <w:p>
+      <w:pPr>
+        <w:spacing w:after="120"/>
+      </w:pPr>
+      <w:r>
+        <w:rPr>
+          <w:rFonts w:ascii="Arial" w:cs="Arial" w:eastAsia="Arial" w:hAnsi="Arial"/>
+          <w:sz w:val="22"/>
+          <w:szCs w:val="22"/>
+        </w:rPr>
+        <w:t xml:space="preserve">Bei Template-Seiten: Lade den ZIP-Ordner herunter und entpacke ihn. Bei Quellcode kopieren: Erstelle eine index.html-Datei und füge den Code ein. Bei v0.dev: Kopiere den generierten Code in dein Projekt.</w:t>
+      </w:r>
+    </w:p>
+    <w:p>
+      <w:pPr>
+        <w:spacing w:after="200"/>
       </w:pPr>
     </w:p>
     <w:p>
@@ -11878,71 +11951,6 @@
     </w:p>
     <w:p>
       <w:pPr>
-        <w:spacing w:after="120"/>
-      </w:pPr>
-      <w:r>
-        <w:rPr>
-          <w:rFonts w:ascii="Arial" w:cs="Arial" w:eastAsia="Arial" w:hAnsi="Arial"/>
-          <w:sz w:val="22"/>
-          <w:szCs w:val="22"/>
-        </w:rPr>
-        <w:t xml:space="preserve">4. SSL-Zertifikat (HTTPS) — Pflicht für jede Website mit Formularen</w:t>
-      </w:r>
-    </w:p>
-    <w:p>
-      <w:pPr>
-        <w:spacing w:after="120"/>
-      </w:pPr>
-      <w:r>
-        <w:rPr>
-          <w:rFonts w:ascii="Arial" w:cs="Arial" w:eastAsia="Arial" w:hAnsi="Arial"/>
-          <w:sz w:val="22"/>
-          <w:szCs w:val="22"/>
-        </w:rPr>
-        <w:t xml:space="preserve">5. Barrierefreiheit — ab Juni 2025 Pflicht für Online-Shops und Dienstleister</w:t>
-      </w:r>
-    </w:p>
-    <w:p>
-      <w:pPr>
-        <w:spacing w:after="120"/>
-      </w:pPr>
-      <w:r>
-        <w:rPr>
-          <w:rFonts w:ascii="Arial" w:cs="Arial" w:eastAsia="Arial" w:hAnsi="Arial"/>
-          <w:sz w:val="22"/>
-          <w:szCs w:val="22"/>
-        </w:rPr>
-        <w:t xml:space="preserve">6. AGB — wenn du Produkte oder Dienstleistungen online verkaufst</w:t>
-      </w:r>
-    </w:p>
-    <w:p>
-      <w:pPr>
-        <w:spacing w:after="120"/>
-      </w:pPr>
-      <w:r>
-        <w:rPr>
-          <w:rFonts w:ascii="Arial" w:cs="Arial" w:eastAsia="Arial" w:hAnsi="Arial"/>
-          <w:sz w:val="22"/>
-          <w:szCs w:val="22"/>
-        </w:rPr>
-        <w:t xml:space="preserve">7. Widerrufsbelehrung — wenn du online verkaufst</w:t>
-      </w:r>
-    </w:p>
-    <w:p>
-      <w:pPr>
-        <w:spacing w:after="200"/>
-      </w:pPr>
-    </w:p>
-    <w:p>
-      <w:pPr>
-        <w:pBdr>
-          <w:bottom w:val="single" w:color="E8604C" w:sz="3"/>
-        </w:pBdr>
-        <w:spacing w:after="100"/>
-      </w:pPr>
-    </w:p>
-    <w:p>
-      <w:pPr>
         <w:sectPr>
           <w:headerReference w:type="default" r:id="rId21"/>
           <w:footerReference w:type="default" r:id="rId22"/>
@@ -11952,6 +11960,71 @@
           <w:pgNumType/>
           <w:docGrid w:linePitch="360"/>
         </w:sectPr>
+      </w:pPr>
+    </w:p>
+    <w:p>
+      <w:pPr>
+        <w:spacing w:after="120"/>
+      </w:pPr>
+      <w:r>
+        <w:rPr>
+          <w:rFonts w:ascii="Arial" w:cs="Arial" w:eastAsia="Arial" w:hAnsi="Arial"/>
+          <w:sz w:val="22"/>
+          <w:szCs w:val="22"/>
+        </w:rPr>
+        <w:t xml:space="preserve">4. SSL-Zertifikat (HTTPS) — Pflicht für jede Website mit Formularen</w:t>
+      </w:r>
+    </w:p>
+    <w:p>
+      <w:pPr>
+        <w:spacing w:after="120"/>
+      </w:pPr>
+      <w:r>
+        <w:rPr>
+          <w:rFonts w:ascii="Arial" w:cs="Arial" w:eastAsia="Arial" w:hAnsi="Arial"/>
+          <w:sz w:val="22"/>
+          <w:szCs w:val="22"/>
+        </w:rPr>
+        <w:t xml:space="preserve">5. Barrierefreiheit — ab Juni 2025 Pflicht für Online-Shops und Dienstleister</w:t>
+      </w:r>
+    </w:p>
+    <w:p>
+      <w:pPr>
+        <w:spacing w:after="120"/>
+      </w:pPr>
+      <w:r>
+        <w:rPr>
+          <w:rFonts w:ascii="Arial" w:cs="Arial" w:eastAsia="Arial" w:hAnsi="Arial"/>
+          <w:sz w:val="22"/>
+          <w:szCs w:val="22"/>
+        </w:rPr>
+        <w:t xml:space="preserve">6. AGB — wenn du Produkte oder Dienstleistungen online verkaufst</w:t>
+      </w:r>
+    </w:p>
+    <w:p>
+      <w:pPr>
+        <w:spacing w:after="120"/>
+      </w:pPr>
+      <w:r>
+        <w:rPr>
+          <w:rFonts w:ascii="Arial" w:cs="Arial" w:eastAsia="Arial" w:hAnsi="Arial"/>
+          <w:sz w:val="22"/>
+          <w:szCs w:val="22"/>
+        </w:rPr>
+        <w:t xml:space="preserve">7. Widerrufsbelehrung — wenn du online verkaufst</w:t>
+      </w:r>
+    </w:p>
+    <w:p>
+      <w:pPr>
+        <w:spacing w:after="200"/>
+      </w:pPr>
+    </w:p>
+    <w:p>
+      <w:pPr>
+        <w:pBdr>
+          <w:bottom w:val="single" w:color="E8604C" w:sz="3"/>
+        </w:pBdr>
+        <w:spacing w:after="100"/>
       </w:pPr>
     </w:p>
     <w:p>
@@ -12834,6 +12907,886 @@
     </w:p>
     <w:p>
       <w:pPr>
+        <w:pStyle w:val="Heading3"/>
+      </w:pPr>
+      <w:r>
+        <w:rPr>
+          <w:b/>
+          <w:bCs/>
+        </w:rPr>
+        <w:t xml:space="preserve">Vor dem Launch — HTML-Struktur prüfen</w:t>
+      </w:r>
+    </w:p>
+    <w:p>
+      <w:pPr>
+        <w:spacing w:after="120"/>
+      </w:pPr>
+      <w:r>
+        <w:rPr>
+          <w:rFonts w:ascii="Arial" w:cs="Arial" w:eastAsia="Arial" w:hAnsi="Arial"/>
+          <w:sz w:val="22"/>
+          <w:szCs w:val="22"/>
+        </w:rPr>
+        <w:t xml:space="preserve">Bevor deine Website live geht, solltest du Claude einmal bitten, den gesamten Code durchzugehen und sauber zu machen. Das ist wie eine Endkontrolle beim Auto vor der ersten Fahrt: Alles muss sitzen.</w:t>
+      </w:r>
+    </w:p>
+    <w:p>
+      <w:pPr>
+        <w:spacing w:after="200"/>
+      </w:pPr>
+    </w:p>
+    <w:p>
+      <w:pPr>
+        <w:spacing w:after="120"/>
+      </w:pPr>
+      <w:r>
+        <w:rPr>
+          <w:rFonts w:ascii="Arial" w:cs="Arial" w:eastAsia="Arial" w:hAnsi="Arial"/>
+          <w:b/>
+          <w:bCs/>
+          <w:sz w:val="22"/>
+          <w:szCs w:val="22"/>
+        </w:rPr>
+        <w:t xml:space="preserve">Was muss in jede HTML-Seite?</w:t>
+      </w:r>
+    </w:p>
+    <w:p>
+      <w:pPr>
+        <w:spacing w:after="120"/>
+      </w:pPr>
+      <w:r>
+        <w:rPr>
+          <w:rFonts w:ascii="Arial" w:cs="Arial" w:eastAsia="Arial" w:hAnsi="Arial"/>
+          <w:sz w:val="22"/>
+          <w:szCs w:val="22"/>
+        </w:rPr>
+        <w:t xml:space="preserve">Jede einzelne Seite deiner Website braucht bestimmte Angaben im &lt;head&gt;-Bereich. Das ist der unsichtbare Teil deiner Seite, den Suchmaschinen und Browser lesen. Wenn das fehlt, sieht deine Seite in Google schlecht aus oder funktioniert nicht richtig.</w:t>
+      </w:r>
+    </w:p>
+    <w:p>
+      <w:pPr>
+        <w:spacing w:after="200"/>
+      </w:pPr>
+    </w:p>
+    <w:p>
+      <w:pPr>
+        <w:spacing w:after="120"/>
+      </w:pPr>
+      <w:r>
+        <w:rPr>
+          <w:rFonts w:ascii="Arial" w:cs="Arial" w:eastAsia="Arial" w:hAnsi="Arial"/>
+          <w:sz w:val="22"/>
+          <w:szCs w:val="22"/>
+        </w:rPr>
+        <w:t xml:space="preserve">• Title-Tag — Der Titel, der im Browser-Tab und bei Google angezeigt wird (max. 60 Zeichen)</w:t>
+      </w:r>
+    </w:p>
+    <w:p>
+      <w:pPr>
+        <w:spacing w:after="120"/>
+      </w:pPr>
+      <w:r>
+        <w:rPr>
+          <w:rFonts w:ascii="Arial" w:cs="Arial" w:eastAsia="Arial" w:hAnsi="Arial"/>
+          <w:sz w:val="22"/>
+          <w:szCs w:val="22"/>
+        </w:rPr>
+        <w:t xml:space="preserve">• Meta-Description — Die Beschreibung unter dem Titel bei Google (max. 160 Zeichen)</w:t>
+      </w:r>
+    </w:p>
+    <w:p>
+      <w:pPr>
+        <w:spacing w:after="120"/>
+      </w:pPr>
+      <w:r>
+        <w:rPr>
+          <w:rFonts w:ascii="Arial" w:cs="Arial" w:eastAsia="Arial" w:hAnsi="Arial"/>
+          <w:sz w:val="22"/>
+          <w:szCs w:val="22"/>
+        </w:rPr>
+        <w:t xml:space="preserve">• Viewport-Tag — Damit deine Seite auf dem Handy richtig angezeigt wird</w:t>
+      </w:r>
+    </w:p>
+    <w:p>
+      <w:pPr>
+        <w:spacing w:after="120"/>
+      </w:pPr>
+      <w:r>
+        <w:rPr>
+          <w:rFonts w:ascii="Arial" w:cs="Arial" w:eastAsia="Arial" w:hAnsi="Arial"/>
+          <w:sz w:val="22"/>
+          <w:szCs w:val="22"/>
+        </w:rPr>
+        <w:t xml:space="preserve">• Language-Attribut — &lt;html lang="de"&gt; damit Browser und Screenreader wissen: diese Seite ist auf Deutsch</w:t>
+      </w:r>
+    </w:p>
+    <w:p>
+      <w:pPr>
+        <w:spacing w:after="120"/>
+      </w:pPr>
+      <w:r>
+        <w:rPr>
+          <w:rFonts w:ascii="Arial" w:cs="Arial" w:eastAsia="Arial" w:hAnsi="Arial"/>
+          <w:sz w:val="22"/>
+          <w:szCs w:val="22"/>
+        </w:rPr>
+        <w:t xml:space="preserve">• Charset — &lt;meta charset="UTF-8"&gt; damit Umlaute (ä, ö, ü, ß) korrekt angezeigt werden</w:t>
+      </w:r>
+    </w:p>
+    <w:p>
+      <w:pPr>
+        <w:spacing w:after="120"/>
+      </w:pPr>
+      <w:r>
+        <w:rPr>
+          <w:rFonts w:ascii="Arial" w:cs="Arial" w:eastAsia="Arial" w:hAnsi="Arial"/>
+          <w:sz w:val="22"/>
+          <w:szCs w:val="22"/>
+        </w:rPr>
+        <w:t xml:space="preserve">• Favicon — Das kleine Icon im Browser-Tab (16x16 oder 32x32 Pixel)</w:t>
+      </w:r>
+    </w:p>
+    <w:p>
+      <w:pPr>
+        <w:spacing w:after="120"/>
+      </w:pPr>
+      <w:r>
+        <w:rPr>
+          <w:rFonts w:ascii="Arial" w:cs="Arial" w:eastAsia="Arial" w:hAnsi="Arial"/>
+          <w:sz w:val="22"/>
+          <w:szCs w:val="22"/>
+        </w:rPr>
+        <w:t xml:space="preserve">• Open Graph Tags — Damit deine Seite beim Teilen auf WhatsApp, Facebook etc. gut aussieht (Titel, Beschreibung, Bild)</w:t>
+      </w:r>
+    </w:p>
+    <w:p>
+      <w:pPr>
+        <w:spacing w:after="200"/>
+      </w:pPr>
+    </w:p>
+    <w:tbl>
+      <w:tblPr>
+        <w:tblW w:type="dxa" w:w="9026"/>
+        <w:tblBorders>
+          <w:top w:val="single" w:color="auto" w:sz="4"/>
+          <w:left w:val="single" w:color="auto" w:sz="4"/>
+          <w:bottom w:val="single" w:color="auto" w:sz="4"/>
+          <w:right w:val="single" w:color="auto" w:sz="4"/>
+          <w:insideH w:val="single" w:color="auto" w:sz="4"/>
+          <w:insideV w:val="single" w:color="auto" w:sz="4"/>
+        </w:tblBorders>
+      </w:tblPr>
+      <w:tblGrid>
+        <w:gridCol w:w="9026"/>
+      </w:tblGrid>
+      <w:tr>
+        <w:tc>
+          <w:tcPr>
+            <w:tcW w:type="dxa" w:w="9026"/>
+            <w:tcBorders>
+              <w:top w:val="single" w:color="CCCCCC" w:sz="1"/>
+              <w:left w:val="single" w:color="CCCCCC" w:sz="1"/>
+              <w:bottom w:val="single" w:color="CCCCCC" w:sz="1"/>
+              <w:right w:val="single" w:color="CCCCCC" w:sz="1"/>
+            </w:tcBorders>
+            <w:shd w:fill="FFF3F0" w:val="clear"/>
+            <w:tcMar>
+              <w:top w:type="dxa" w:w="120"/>
+              <w:left w:type="dxa" w:w="200"/>
+              <w:bottom w:type="dxa" w:w="120"/>
+              <w:right w:type="dxa" w:w="200"/>
+            </w:tcMar>
+          </w:tcPr>
+          <w:p>
+            <w:r>
+              <w:rPr>
+                <w:b/>
+                <w:bCs/>
+                <w:color w:val="E8604C"/>
+                <w:sz w:val="20"/>
+                <w:szCs w:val="20"/>
+              </w:rPr>
+              <w:t xml:space="preserve">Prompt: Meta-Tags für alle Seiten</w:t>
+            </w:r>
+          </w:p>
+          <w:p>
+            <w:pPr>
+              <w:spacing w:before="80"/>
+            </w:pPr>
+            <w:r>
+              <w:rPr>
+                <w:i/>
+                <w:iCs/>
+                <w:sz w:val="20"/>
+                <w:szCs w:val="20"/>
+              </w:rPr>
+              <w:t xml:space="preserve">Prüfe meine komplette Website und ergänze auf JEDER Seite die folgenden Meta-Tags im &lt;head&gt;: 1) &lt;title&gt; — einzigartiger, beschreibender Titel (max. 60 Zeichen) 2) &lt;meta name="description"&gt; — einzigartige Beschreibung mit Handlungsaufforderung (max. 160 Zeichen) 3) &lt;meta name="viewport" content="width=device-width, initial-scale=1.0"&gt; 4) &lt;meta charset="UTF-8"&gt; 5) &lt;html lang="de"&gt; 6) Favicon-Link 7) Open Graph Tags (og:title, og:description, og:image, og:url, og:type). Zeige mir eine Tabelle: Seite | Title-Tag | Meta-Description | Was fehlte.</w:t>
+            </w:r>
+          </w:p>
+        </w:tc>
+      </w:tr>
+    </w:tbl>
+    <w:p>
+      <w:pPr>
+        <w:spacing w:after="200"/>
+      </w:pPr>
+    </w:p>
+    <w:p>
+      <w:pPr>
+        <w:spacing w:after="120"/>
+      </w:pPr>
+      <w:r>
+        <w:rPr>
+          <w:rFonts w:ascii="Arial" w:cs="Arial" w:eastAsia="Arial" w:hAnsi="Arial"/>
+          <w:b/>
+          <w:bCs/>
+          <w:sz w:val="22"/>
+          <w:szCs w:val="22"/>
+        </w:rPr>
+        <w:t xml:space="preserve">HTML-Struktur prüfen</w:t>
+      </w:r>
+    </w:p>
+    <w:p>
+      <w:pPr>
+        <w:spacing w:after="120"/>
+      </w:pPr>
+      <w:r>
+        <w:rPr>
+          <w:rFonts w:ascii="Arial" w:cs="Arial" w:eastAsia="Arial" w:hAnsi="Arial"/>
+          <w:sz w:val="22"/>
+          <w:szCs w:val="22"/>
+        </w:rPr>
+        <w:t xml:space="preserve">Neben den Meta-Tags gibt es ein paar Regeln, die jede gute Website einhalten sollte. Claude kann das alles auf einmal prüfen:</w:t>
+      </w:r>
+    </w:p>
+    <w:p>
+      <w:pPr>
+        <w:spacing w:after="200"/>
+      </w:pPr>
+    </w:p>
+    <w:p>
+      <w:pPr>
+        <w:spacing w:after="120"/>
+      </w:pPr>
+      <w:r>
+        <w:rPr>
+          <w:rFonts w:ascii="Arial" w:cs="Arial" w:eastAsia="Arial" w:hAnsi="Arial"/>
+          <w:sz w:val="22"/>
+          <w:szCs w:val="22"/>
+        </w:rPr>
+        <w:t xml:space="preserve">• Genau eine H1-Überschrift pro Seite (die wichtigste Überschrift)</w:t>
+      </w:r>
+    </w:p>
+    <w:p>
+      <w:pPr>
+        <w:spacing w:after="120"/>
+      </w:pPr>
+      <w:r>
+        <w:rPr>
+          <w:rFonts w:ascii="Arial" w:cs="Arial" w:eastAsia="Arial" w:hAnsi="Arial"/>
+          <w:sz w:val="22"/>
+          <w:szCs w:val="22"/>
+        </w:rPr>
+        <w:t xml:space="preserve">• Überschriften-Hierarchie einhalten (H1 &gt; H2 &gt; H3, keine Sprünge)</w:t>
+      </w:r>
+    </w:p>
+    <w:p>
+      <w:pPr>
+        <w:spacing w:after="120"/>
+      </w:pPr>
+      <w:r>
+        <w:rPr>
+          <w:rFonts w:ascii="Arial" w:cs="Arial" w:eastAsia="Arial" w:hAnsi="Arial"/>
+          <w:sz w:val="22"/>
+          <w:szCs w:val="22"/>
+        </w:rPr>
+        <w:t xml:space="preserve">• Alt-Texte auf allen Bildern (für Suchmaschinen und Barrierefreiheit)</w:t>
+      </w:r>
+    </w:p>
+    <w:p>
+      <w:pPr>
+        <w:spacing w:after="120"/>
+      </w:pPr>
+      <w:r>
+        <w:rPr>
+          <w:rFonts w:ascii="Arial" w:cs="Arial" w:eastAsia="Arial" w:hAnsi="Arial"/>
+          <w:sz w:val="22"/>
+          <w:szCs w:val="22"/>
+        </w:rPr>
+        <w:t xml:space="preserve">• Alle Links funktionieren (keine kaputten 404-Links)</w:t>
+      </w:r>
+    </w:p>
+    <w:p>
+      <w:pPr>
+        <w:spacing w:after="120"/>
+      </w:pPr>
+      <w:r>
+        <w:rPr>
+          <w:rFonts w:ascii="Arial" w:cs="Arial" w:eastAsia="Arial" w:hAnsi="Arial"/>
+          <w:sz w:val="22"/>
+          <w:szCs w:val="22"/>
+        </w:rPr>
+        <w:t xml:space="preserve">• Keine leeren Elemente oder doppelten IDs</w:t>
+      </w:r>
+    </w:p>
+    <w:p>
+      <w:pPr>
+        <w:spacing w:after="120"/>
+      </w:pPr>
+      <w:r>
+        <w:rPr>
+          <w:rFonts w:ascii="Arial" w:cs="Arial" w:eastAsia="Arial" w:hAnsi="Arial"/>
+          <w:sz w:val="22"/>
+          <w:szCs w:val="22"/>
+        </w:rPr>
+        <w:t xml:space="preserve">• Saubere URL-Struktur (kurz, sprechend, ohne Sonderzeichen)</w:t>
+      </w:r>
+    </w:p>
+    <w:p>
+      <w:pPr>
+        <w:spacing w:after="120"/>
+      </w:pPr>
+      <w:r>
+        <w:rPr>
+          <w:rFonts w:ascii="Arial" w:cs="Arial" w:eastAsia="Arial" w:hAnsi="Arial"/>
+          <w:sz w:val="22"/>
+          <w:szCs w:val="22"/>
+        </w:rPr>
+        <w:t xml:space="preserve">• Navigation funktioniert auf allen Seiten</w:t>
+      </w:r>
+    </w:p>
+    <w:p>
+      <w:pPr>
+        <w:spacing w:after="200"/>
+      </w:pPr>
+    </w:p>
+    <w:tbl>
+      <w:tblPr>
+        <w:tblW w:type="dxa" w:w="9026"/>
+        <w:tblBorders>
+          <w:top w:val="single" w:color="auto" w:sz="4"/>
+          <w:left w:val="single" w:color="auto" w:sz="4"/>
+          <w:bottom w:val="single" w:color="auto" w:sz="4"/>
+          <w:right w:val="single" w:color="auto" w:sz="4"/>
+          <w:insideH w:val="single" w:color="auto" w:sz="4"/>
+          <w:insideV w:val="single" w:color="auto" w:sz="4"/>
+        </w:tblBorders>
+      </w:tblPr>
+      <w:tblGrid>
+        <w:gridCol w:w="9026"/>
+      </w:tblGrid>
+      <w:tr>
+        <w:tc>
+          <w:tcPr>
+            <w:tcW w:type="dxa" w:w="9026"/>
+            <w:tcBorders>
+              <w:top w:val="single" w:color="CCCCCC" w:sz="1"/>
+              <w:left w:val="single" w:color="CCCCCC" w:sz="1"/>
+              <w:bottom w:val="single" w:color="CCCCCC" w:sz="1"/>
+              <w:right w:val="single" w:color="CCCCCC" w:sz="1"/>
+            </w:tcBorders>
+            <w:shd w:fill="FFF3F0" w:val="clear"/>
+            <w:tcMar>
+              <w:top w:type="dxa" w:w="120"/>
+              <w:left w:type="dxa" w:w="200"/>
+              <w:bottom w:type="dxa" w:w="120"/>
+              <w:right w:type="dxa" w:w="200"/>
+            </w:tcMar>
+          </w:tcPr>
+          <w:p>
+            <w:r>
+              <w:rPr>
+                <w:b/>
+                <w:bCs/>
+                <w:color w:val="E8604C"/>
+                <w:sz w:val="20"/>
+                <w:szCs w:val="20"/>
+              </w:rPr>
+              <w:t xml:space="preserve">Prompt: HTML-Audit</w:t>
+            </w:r>
+          </w:p>
+          <w:p>
+            <w:pPr>
+              <w:spacing w:before="80"/>
+            </w:pPr>
+            <w:r>
+              <w:rPr>
+                <w:i/>
+                <w:iCs/>
+                <w:sz w:val="20"/>
+                <w:szCs w:val="20"/>
+              </w:rPr>
+              <w:t xml:space="preserve">Führe ein komplettes HTML-Audit für meine Website durch. Prüfe: 1) Hat jede Seite genau eine H1-Überschrift? 2) Ist die Überschriften-Hierarchie korrekt (H1 &gt; H2 &gt; H3)? 3) Haben alle Bilder Alt-Texte? 4) Gibt es kaputte Links (interne oder externe)? 5) Gibt es leere Elemente, doppelte IDs oder ungültiges HTML? 6) Sind alle URLs sauber (keine Leerzeichen, Umlaute, Sonderzeichen)? 7) Funktioniert die Navigation auf jeder Seite? Erstelle eine Übersicht: Seite | Fehler | Fix | Priorität. Behebe dann alle Fehler direkt.</w:t>
+            </w:r>
+          </w:p>
+        </w:tc>
+      </w:tr>
+    </w:tbl>
+    <w:p>
+      <w:pPr>
+        <w:spacing w:after="200"/>
+      </w:pPr>
+    </w:p>
+    <w:p>
+      <w:pPr>
+        <w:spacing w:after="120"/>
+      </w:pPr>
+      <w:r>
+        <w:rPr>
+          <w:rFonts w:ascii="Arial" w:cs="Arial" w:eastAsia="Arial" w:hAnsi="Arial"/>
+          <w:b/>
+          <w:bCs/>
+          <w:sz w:val="22"/>
+          <w:szCs w:val="22"/>
+        </w:rPr>
+        <w:t xml:space="preserve">Performance-Check</w:t>
+      </w:r>
+    </w:p>
+    <w:p>
+      <w:pPr>
+        <w:spacing w:after="120"/>
+      </w:pPr>
+      <w:r>
+        <w:rPr>
+          <w:rFonts w:ascii="Arial" w:cs="Arial" w:eastAsia="Arial" w:hAnsi="Arial"/>
+          <w:sz w:val="22"/>
+          <w:szCs w:val="22"/>
+        </w:rPr>
+        <w:t xml:space="preserve">Bevor du live gehst, lass Claude auch die Ladezeit prüfen. Wenn deine Seite langsam lädt, springen Besucher ab:</w:t>
+      </w:r>
+    </w:p>
+    <w:p>
+      <w:pPr>
+        <w:spacing w:after="200"/>
+      </w:pPr>
+    </w:p>
+    <w:p>
+      <w:pPr>
+        <w:spacing w:after="120"/>
+      </w:pPr>
+      <w:r>
+        <w:rPr>
+          <w:rFonts w:ascii="Arial" w:cs="Arial" w:eastAsia="Arial" w:hAnsi="Arial"/>
+          <w:sz w:val="22"/>
+          <w:szCs w:val="22"/>
+        </w:rPr>
+        <w:t xml:space="preserve">• Bilder komprimiert? (WebP-Format, max. 200 KB pro Bild)</w:t>
+      </w:r>
+    </w:p>
+    <w:p>
+      <w:pPr>
+        <w:spacing w:after="120"/>
+      </w:pPr>
+      <w:r>
+        <w:rPr>
+          <w:rFonts w:ascii="Arial" w:cs="Arial" w:eastAsia="Arial" w:hAnsi="Arial"/>
+          <w:sz w:val="22"/>
+          <w:szCs w:val="22"/>
+        </w:rPr>
+        <w:t xml:space="preserve">• CSS und JavaScript minimiert? (Minify)</w:t>
+      </w:r>
+    </w:p>
+    <w:p>
+      <w:pPr>
+        <w:spacing w:after="120"/>
+      </w:pPr>
+      <w:r>
+        <w:rPr>
+          <w:rFonts w:ascii="Arial" w:cs="Arial" w:eastAsia="Arial" w:hAnsi="Arial"/>
+          <w:sz w:val="22"/>
+          <w:szCs w:val="22"/>
+        </w:rPr>
+        <w:t xml:space="preserve">• Lazy Loading für Bilder? (Bilder erst laden, wenn sie sichtbar werden)</w:t>
+      </w:r>
+    </w:p>
+    <w:p>
+      <w:pPr>
+        <w:spacing w:after="120"/>
+      </w:pPr>
+      <w:r>
+        <w:rPr>
+          <w:rFonts w:ascii="Arial" w:cs="Arial" w:eastAsia="Arial" w:hAnsi="Arial"/>
+          <w:sz w:val="22"/>
+          <w:szCs w:val="22"/>
+        </w:rPr>
+        <w:t xml:space="preserve">• Google Fonts optimiert? (Nur die Schriftschnitte laden, die du brauchst)</w:t>
+      </w:r>
+    </w:p>
+    <w:p>
+      <w:pPr>
+        <w:spacing w:after="200"/>
+      </w:pPr>
+    </w:p>
+    <w:tbl>
+      <w:tblPr>
+        <w:tblW w:type="dxa" w:w="9026"/>
+        <w:tblBorders>
+          <w:top w:val="single" w:color="auto" w:sz="4"/>
+          <w:left w:val="single" w:color="auto" w:sz="4"/>
+          <w:bottom w:val="single" w:color="auto" w:sz="4"/>
+          <w:right w:val="single" w:color="auto" w:sz="4"/>
+          <w:insideH w:val="single" w:color="auto" w:sz="4"/>
+          <w:insideV w:val="single" w:color="auto" w:sz="4"/>
+        </w:tblBorders>
+      </w:tblPr>
+      <w:tblGrid>
+        <w:gridCol w:w="9026"/>
+      </w:tblGrid>
+      <w:tr>
+        <w:tc>
+          <w:tcPr>
+            <w:tcW w:type="dxa" w:w="9026"/>
+            <w:tcBorders>
+              <w:top w:val="single" w:color="CCCCCC" w:sz="1"/>
+              <w:left w:val="single" w:color="CCCCCC" w:sz="1"/>
+              <w:bottom w:val="single" w:color="CCCCCC" w:sz="1"/>
+              <w:right w:val="single" w:color="CCCCCC" w:sz="1"/>
+            </w:tcBorders>
+            <w:shd w:fill="FFF3F0" w:val="clear"/>
+            <w:tcMar>
+              <w:top w:type="dxa" w:w="120"/>
+              <w:left w:type="dxa" w:w="200"/>
+              <w:bottom w:type="dxa" w:w="120"/>
+              <w:right w:type="dxa" w:w="200"/>
+            </w:tcMar>
+          </w:tcPr>
+          <w:p>
+            <w:r>
+              <w:rPr>
+                <w:b/>
+                <w:bCs/>
+                <w:color w:val="E8604C"/>
+                <w:sz w:val="20"/>
+                <w:szCs w:val="20"/>
+              </w:rPr>
+              <w:t xml:space="preserve">Prompt: Performance-Optimierung</w:t>
+            </w:r>
+          </w:p>
+          <w:p>
+            <w:pPr>
+              <w:spacing w:before="80"/>
+            </w:pPr>
+            <w:r>
+              <w:rPr>
+                <w:i/>
+                <w:iCs/>
+                <w:sz w:val="20"/>
+                <w:szCs w:val="20"/>
+              </w:rPr>
+              <w:t xml:space="preserve">Optimiere meine Website für schnelle Ladezeiten: 1) Komprimiere alle Bilder auf WebP-Format (max. 200 KB) 2) Minimiere CSS und JavaScript (Minify) 3) Richte Lazy Loading für alle Bilder ein 4) Optimiere die eingebundenen Google Fonts (nur benötigte Schriftschnitte) 5) Entferne unbenutzten CSS- und JavaScript-Code 6) Prüfe, ob alle Dateien korrekt eingebunden sind. Zeige mir vorher/nachher: Was hast du geändert?</w:t>
+            </w:r>
+          </w:p>
+        </w:tc>
+      </w:tr>
+    </w:tbl>
+    <w:p>
+      <w:pPr>
+        <w:spacing w:after="200"/>
+      </w:pPr>
+    </w:p>
+    <w:p>
+      <w:pPr>
+        <w:spacing w:after="120"/>
+      </w:pPr>
+      <w:r>
+        <w:rPr>
+          <w:rFonts w:ascii="Arial" w:cs="Arial" w:eastAsia="Arial" w:hAnsi="Arial"/>
+          <w:b/>
+          <w:bCs/>
+          <w:sz w:val="22"/>
+          <w:szCs w:val="22"/>
+        </w:rPr>
+        <w:t xml:space="preserve">Noch wichtige Dateien anlegen</w:t>
+      </w:r>
+    </w:p>
+    <w:p>
+      <w:pPr>
+        <w:spacing w:after="120"/>
+      </w:pPr>
+      <w:r>
+        <w:rPr>
+          <w:rFonts w:ascii="Arial" w:cs="Arial" w:eastAsia="Arial" w:hAnsi="Arial"/>
+          <w:sz w:val="22"/>
+          <w:szCs w:val="22"/>
+        </w:rPr>
+        <w:t xml:space="preserve">Diese Dateien braucht jede Website — sie liegen im Hauptordner deines Projekts:</w:t>
+      </w:r>
+    </w:p>
+    <w:p>
+      <w:pPr>
+        <w:spacing w:after="200"/>
+      </w:pPr>
+    </w:p>
+    <w:p>
+      <w:pPr>
+        <w:spacing w:after="120"/>
+      </w:pPr>
+      <w:r>
+        <w:rPr>
+          <w:rFonts w:ascii="Arial" w:cs="Arial" w:eastAsia="Arial" w:hAnsi="Arial"/>
+          <w:sz w:val="22"/>
+          <w:szCs w:val="22"/>
+        </w:rPr>
+        <w:t xml:space="preserve">• sitemap.xml — Eine Liste aller Seiten, damit Suchmaschinen deine Website komplett finden</w:t>
+      </w:r>
+    </w:p>
+    <w:p>
+      <w:pPr>
+        <w:sectPr>
+          <w:headerReference w:type="default" r:id="rId23"/>
+          <w:footerReference w:type="default" r:id="rId24"/>
+          <w:type w:val="continuous"/>
+          <w:pgSz w:w="11906" w:h="16838" w:orient="portrait"/>
+          <w:pgMar w:top="1440" w:right="1440" w:bottom="1440" w:left="1440" w:header="708" w:footer="708" w:gutter="0"/>
+          <w:pgNumType/>
+          <w:docGrid w:linePitch="360"/>
+        </w:sectPr>
+      </w:pPr>
+    </w:p>
+    <w:p>
+      <w:pPr>
+        <w:spacing w:after="120"/>
+      </w:pPr>
+      <w:r>
+        <w:rPr>
+          <w:rFonts w:ascii="Arial" w:cs="Arial" w:eastAsia="Arial" w:hAnsi="Arial"/>
+          <w:sz w:val="22"/>
+          <w:szCs w:val="22"/>
+        </w:rPr>
+        <w:t xml:space="preserve">• robots.txt — Sagt Suchmaschinen, welche Seiten sie anschauen dürfen</w:t>
+      </w:r>
+    </w:p>
+    <w:p>
+      <w:pPr>
+        <w:spacing w:after="120"/>
+      </w:pPr>
+      <w:r>
+        <w:rPr>
+          <w:rFonts w:ascii="Arial" w:cs="Arial" w:eastAsia="Arial" w:hAnsi="Arial"/>
+          <w:sz w:val="22"/>
+          <w:szCs w:val="22"/>
+        </w:rPr>
+        <w:t xml:space="preserve">• 404.html — Eine eigene Fehlerseite, falls jemand eine falsche URL eingibt</w:t>
+      </w:r>
+    </w:p>
+    <w:p>
+      <w:pPr>
+        <w:spacing w:after="120"/>
+      </w:pPr>
+      <w:r>
+        <w:rPr>
+          <w:rFonts w:ascii="Arial" w:cs="Arial" w:eastAsia="Arial" w:hAnsi="Arial"/>
+          <w:sz w:val="22"/>
+          <w:szCs w:val="22"/>
+        </w:rPr>
+        <w:t xml:space="preserve">• favicon.ico — Das kleine Symbol im Browser-Tab</w:t>
+      </w:r>
+    </w:p>
+    <w:p>
+      <w:pPr>
+        <w:spacing w:after="200"/>
+      </w:pPr>
+    </w:p>
+    <w:tbl>
+      <w:tblPr>
+        <w:tblW w:type="dxa" w:w="9026"/>
+        <w:tblBorders>
+          <w:top w:val="single" w:color="auto" w:sz="4"/>
+          <w:left w:val="single" w:color="auto" w:sz="4"/>
+          <w:bottom w:val="single" w:color="auto" w:sz="4"/>
+          <w:right w:val="single" w:color="auto" w:sz="4"/>
+          <w:insideH w:val="single" w:color="auto" w:sz="4"/>
+          <w:insideV w:val="single" w:color="auto" w:sz="4"/>
+        </w:tblBorders>
+      </w:tblPr>
+      <w:tblGrid>
+        <w:gridCol w:w="9026"/>
+      </w:tblGrid>
+      <w:tr>
+        <w:tc>
+          <w:tcPr>
+            <w:tcW w:type="dxa" w:w="9026"/>
+            <w:tcBorders>
+              <w:top w:val="single" w:color="CCCCCC" w:sz="1"/>
+              <w:left w:val="single" w:color="CCCCCC" w:sz="1"/>
+              <w:bottom w:val="single" w:color="CCCCCC" w:sz="1"/>
+              <w:right w:val="single" w:color="CCCCCC" w:sz="1"/>
+            </w:tcBorders>
+            <w:shd w:fill="FFF3F0" w:val="clear"/>
+            <w:tcMar>
+              <w:top w:type="dxa" w:w="120"/>
+              <w:left w:type="dxa" w:w="200"/>
+              <w:bottom w:type="dxa" w:w="120"/>
+              <w:right w:type="dxa" w:w="200"/>
+            </w:tcMar>
+          </w:tcPr>
+          <w:p>
+            <w:r>
+              <w:rPr>
+                <w:b/>
+                <w:bCs/>
+                <w:color w:val="E8604C"/>
+                <w:sz w:val="20"/>
+                <w:szCs w:val="20"/>
+              </w:rPr>
+              <w:t xml:space="preserve">Prompt: Website-Dateien anlegen</w:t>
+            </w:r>
+          </w:p>
+          <w:p>
+            <w:pPr>
+              <w:spacing w:before="80"/>
+            </w:pPr>
+            <w:r>
+              <w:rPr>
+                <w:i/>
+                <w:iCs/>
+                <w:sz w:val="20"/>
+                <w:szCs w:val="20"/>
+              </w:rPr>
+              <w:t xml:space="preserve">Erstelle für meine Website folgende Dateien: 1) sitemap.xml — mit allen Seiten meiner Website: [Startseite, Über mich, Leistungen, Kontakt, Impressum, Datenschutz] 2) robots.txt — alle Seiten erlauben, Sitemap verlinken 3) 404.html — eine freundliche Fehlerseite mit Link zurück zur Startseite, im gleichen Design wie der Rest der Website 4) Favicon — ein einfaches Favicon aus meinen Markenfarben. Baue alle Dateien korrekt ein und verlinke sie.</w:t>
+            </w:r>
+          </w:p>
+        </w:tc>
+      </w:tr>
+    </w:tbl>
+    <w:p>
+      <w:pPr>
+        <w:spacing w:after="200"/>
+      </w:pPr>
+    </w:p>
+    <w:tbl>
+      <w:tblPr>
+        <w:tblW w:type="dxa" w:w="9026"/>
+        <w:tblBorders>
+          <w:top w:val="single" w:color="auto" w:sz="4"/>
+          <w:left w:val="single" w:color="auto" w:sz="4"/>
+          <w:bottom w:val="single" w:color="auto" w:sz="4"/>
+          <w:right w:val="single" w:color="auto" w:sz="4"/>
+          <w:insideH w:val="single" w:color="auto" w:sz="4"/>
+          <w:insideV w:val="single" w:color="auto" w:sz="4"/>
+        </w:tblBorders>
+      </w:tblPr>
+      <w:tblGrid>
+        <w:gridCol w:w="9026"/>
+      </w:tblGrid>
+      <w:tr>
+        <w:tc>
+          <w:tcPr>
+            <w:tcW w:type="dxa" w:w="9026"/>
+            <w:tcBorders>
+              <w:top w:val="single" w:color="CCCCCC" w:sz="1"/>
+              <w:left w:val="single" w:color="CCCCCC" w:sz="1"/>
+              <w:bottom w:val="single" w:color="CCCCCC" w:sz="1"/>
+              <w:right w:val="single" w:color="CCCCCC" w:sz="1"/>
+            </w:tcBorders>
+            <w:shd w:fill="FFF3F0" w:val="clear"/>
+            <w:tcMar>
+              <w:top w:type="dxa" w:w="120"/>
+              <w:left w:type="dxa" w:w="200"/>
+              <w:bottom w:type="dxa" w:w="120"/>
+              <w:right w:type="dxa" w:w="200"/>
+            </w:tcMar>
+          </w:tcPr>
+          <w:p>
+            <w:r>
+              <w:rPr>
+                <w:b/>
+                <w:bCs/>
+                <w:color w:val="E8604C"/>
+                <w:sz w:val="20"/>
+                <w:szCs w:val="20"/>
+              </w:rPr>
+              <w:t xml:space="preserve">Mega-Prompt: Kompletter Launch-Check</w:t>
+            </w:r>
+          </w:p>
+          <w:p>
+            <w:pPr>
+              <w:spacing w:before="80"/>
+            </w:pPr>
+            <w:r>
+              <w:rPr>
+                <w:i/>
+                <w:iCs/>
+                <w:sz w:val="20"/>
+                <w:szCs w:val="20"/>
+              </w:rPr>
+              <w:t xml:space="preserve">Meine Website ist fertig und ich möchte sie live stellen. Führe einen kompletten Launch-Check durch, BEVOR ich sie veröffentliche: META-TAGS: 1) Title-Tag auf jeder Seite (max. 60 Zeichen)? 2) Meta-Description auf jeder Seite (max. 160 Zeichen)? 3) Viewport-Tag gesetzt? 4) Charset UTF-8? 5) Language auf 'de'? 6) Open Graph Tags auf jeder Seite? 7) Favicon eingebunden? HTML-STRUKTUR: 8) Genau eine H1 pro Seite? 9) Überschriften-Hierarchie korrekt? 10) Alt-Texte auf allen Bildern? 11) Keine kaputten Links? 12) Saubere URLs? PERFORMANCE: 13) Bilder komprimiert (WebP, max. 200 KB)? 14) CSS/JS minimiert? 15) Lazy Loading aktiv? DATEIEN: 16) sitemap.xml vorhanden? 17) robots.txt vorhanden? 18) 404-Seite vorhanden? 19) Favicon vorhanden? RECHT: 20) Impressum verlinkt? 21) Datenschutz verlinkt? 22) Cookie-Banner funktioniert? Erstelle eine Checkliste: Punkt | Status (OK/Fehlt) | Aktion. Fixe dann alles, was fehlt.</w:t>
+            </w:r>
+          </w:p>
+        </w:tc>
+      </w:tr>
+    </w:tbl>
+    <w:p>
+      <w:pPr>
+        <w:spacing w:after="200"/>
+      </w:pPr>
+    </w:p>
+    <w:tbl>
+      <w:tblPr>
+        <w:tblW w:type="dxa" w:w="9026"/>
+        <w:tblBorders>
+          <w:top w:val="single" w:color="auto" w:sz="4"/>
+          <w:left w:val="single" w:color="auto" w:sz="4"/>
+          <w:bottom w:val="single" w:color="auto" w:sz="4"/>
+          <w:right w:val="single" w:color="auto" w:sz="4"/>
+          <w:insideH w:val="single" w:color="auto" w:sz="4"/>
+          <w:insideV w:val="single" w:color="auto" w:sz="4"/>
+        </w:tblBorders>
+      </w:tblPr>
+      <w:tblGrid>
+        <w:gridCol w:w="9026"/>
+      </w:tblGrid>
+      <w:tr>
+        <w:tc>
+          <w:tcPr>
+            <w:tcW w:type="dxa" w:w="9026"/>
+            <w:tcBorders>
+              <w:top w:val="single" w:color="CCCCCC" w:sz="1"/>
+              <w:left w:val="single" w:color="CCCCCC" w:sz="1"/>
+              <w:bottom w:val="single" w:color="CCCCCC" w:sz="1"/>
+              <w:right w:val="single" w:color="CCCCCC" w:sz="1"/>
+            </w:tcBorders>
+            <w:shd w:fill="F7F7F5" w:val="clear"/>
+            <w:tcMar>
+              <w:top w:type="dxa" w:w="120"/>
+              <w:left w:type="dxa" w:w="200"/>
+              <w:bottom w:type="dxa" w:w="120"/>
+              <w:right w:type="dxa" w:w="200"/>
+            </w:tcMar>
+          </w:tcPr>
+          <w:p>
+            <w:r>
+              <w:rPr>
+                <w:b/>
+                <w:bCs/>
+                <w:sz w:val="20"/>
+                <w:szCs w:val="20"/>
+              </w:rPr>
+              <w:t xml:space="preserve">Tipp: Dieser Check dauert 15 Minuten</w:t>
+            </w:r>
+          </w:p>
+          <w:p>
+            <w:pPr>
+              <w:spacing w:before="80"/>
+            </w:pPr>
+            <w:r>
+              <w:rPr>
+                <w:sz w:val="20"/>
+                <w:szCs w:val="20"/>
+              </w:rPr>
+              <w:t xml:space="preserve">Lass Claude den Mega-Prompt einmal komplett durchlaufen — das dauert ca. 15 Minuten. Danach ist deine Website technisch sauber und bereit für den Launch. Mach diesen Check BEVOR du auf 'Deploy' klickst.</w:t>
+            </w:r>
+          </w:p>
+        </w:tc>
+      </w:tr>
+    </w:tbl>
+    <w:p>
+      <w:pPr>
+        <w:spacing w:after="200"/>
+      </w:pPr>
+    </w:p>
+    <w:p>
+      <w:pPr>
         <w:spacing w:after="120"/>
       </w:pPr>
       <w:r>
@@ -12962,6 +13915,84 @@
           <w:szCs w:val="20"/>
         </w:rPr>
         <w:t xml:space="preserve">☐  Alle rechtlichen Seiten von jeder Seite aus erreichbar (Footer-Links)</w:t>
+      </w:r>
+    </w:p>
+    <w:p>
+      <w:pPr>
+        <w:spacing w:after="60"/>
+      </w:pPr>
+      <w:r>
+        <w:rPr>
+          <w:rFonts w:ascii="Arial" w:cs="Arial" w:eastAsia="Arial" w:hAnsi="Arial"/>
+          <w:sz w:val="20"/>
+          <w:szCs w:val="20"/>
+        </w:rPr>
+        <w:t xml:space="preserve">☐  Title-Tag und Meta-Description auf jeder Seite</w:t>
+      </w:r>
+    </w:p>
+    <w:p>
+      <w:pPr>
+        <w:spacing w:after="60"/>
+      </w:pPr>
+      <w:r>
+        <w:rPr>
+          <w:rFonts w:ascii="Arial" w:cs="Arial" w:eastAsia="Arial" w:hAnsi="Arial"/>
+          <w:sz w:val="20"/>
+          <w:szCs w:val="20"/>
+        </w:rPr>
+        <w:t xml:space="preserve">☐  HTML-Audit: H1, Alt-Texte, Links, Struktur geprüft</w:t>
+      </w:r>
+    </w:p>
+    <w:p>
+      <w:pPr>
+        <w:spacing w:after="60"/>
+      </w:pPr>
+      <w:r>
+        <w:rPr>
+          <w:rFonts w:ascii="Arial" w:cs="Arial" w:eastAsia="Arial" w:hAnsi="Arial"/>
+          <w:sz w:val="20"/>
+          <w:szCs w:val="20"/>
+        </w:rPr>
+        <w:t xml:space="preserve">☐  Performance: Bilder komprimiert, CSS/JS minimiert, Lazy Loading</w:t>
+      </w:r>
+    </w:p>
+    <w:p>
+      <w:pPr>
+        <w:spacing w:after="60"/>
+      </w:pPr>
+      <w:r>
+        <w:rPr>
+          <w:rFonts w:ascii="Arial" w:cs="Arial" w:eastAsia="Arial" w:hAnsi="Arial"/>
+          <w:sz w:val="20"/>
+          <w:szCs w:val="20"/>
+        </w:rPr>
+        <w:t xml:space="preserve">☐  sitemap.xml, robots.txt, 404-Seite und Favicon angelegt</w:t>
+      </w:r>
+    </w:p>
+    <w:p>
+      <w:pPr>
+        <w:spacing w:after="60"/>
+      </w:pPr>
+      <w:r>
+        <w:rPr>
+          <w:rFonts w:ascii="Arial" w:cs="Arial" w:eastAsia="Arial" w:hAnsi="Arial"/>
+          <w:sz w:val="20"/>
+          <w:szCs w:val="20"/>
+        </w:rPr>
+        <w:t xml:space="preserve">☐  Open Graph Tags auf jeder Seite (für Social Media Sharing)</w:t>
+      </w:r>
+    </w:p>
+    <w:p>
+      <w:pPr>
+        <w:spacing w:after="60"/>
+      </w:pPr>
+      <w:r>
+        <w:rPr>
+          <w:rFonts w:ascii="Arial" w:cs="Arial" w:eastAsia="Arial" w:hAnsi="Arial"/>
+          <w:sz w:val="20"/>
+          <w:szCs w:val="20"/>
+        </w:rPr>
+        <w:t xml:space="preserve">☐  Launch-Check mit Claude durchgeführt (Mega-Prompt)</w:t>
       </w:r>
     </w:p>
     <w:p>
@@ -13530,19 +14561,6 @@
     </w:p>
     <w:p>
       <w:pPr>
-        <w:sectPr>
-          <w:headerReference w:type="default" r:id="rId23"/>
-          <w:footerReference w:type="default" r:id="rId24"/>
-          <w:type w:val="continuous"/>
-          <w:pgSz w:w="11906" w:h="16838" w:orient="portrait"/>
-          <w:pgMar w:top="1440" w:right="1440" w:bottom="1440" w:left="1440" w:header="708" w:footer="708" w:gutter="0"/>
-          <w:pgNumType/>
-          <w:docGrid w:linePitch="360"/>
-        </w:sectPr>
-      </w:pPr>
-    </w:p>
-    <w:p>
-      <w:pPr>
         <w:spacing w:after="200"/>
         <w:jc w:val="center"/>
       </w:pPr>
@@ -14025,6 +15043,19 @@
     </w:p>
     <w:p>
       <w:pPr>
+        <w:sectPr>
+          <w:headerReference w:type="default" r:id="rId25"/>
+          <w:footerReference w:type="default" r:id="rId26"/>
+          <w:type w:val="continuous"/>
+          <w:pgSz w:w="11906" w:h="16838" w:orient="portrait"/>
+          <w:pgMar w:top="1440" w:right="1440" w:bottom="1440" w:left="1440" w:header="708" w:footer="708" w:gutter="0"/>
+          <w:pgNumType/>
+          <w:docGrid w:linePitch="360"/>
+        </w:sectPr>
+      </w:pPr>
+    </w:p>
+    <w:p>
+      <w:pPr>
         <w:spacing w:after="120"/>
       </w:pPr>
       <w:r>
@@ -15023,19 +16054,6 @@
         </w:tc>
       </w:tr>
     </w:tbl>
-    <w:p>
-      <w:pPr>
-        <w:sectPr>
-          <w:headerReference w:type="default" r:id="rId25"/>
-          <w:footerReference w:type="default" r:id="rId26"/>
-          <w:type w:val="continuous"/>
-          <w:pgSz w:w="11906" w:h="16838" w:orient="portrait"/>
-          <w:pgMar w:top="1440" w:right="1440" w:bottom="1440" w:left="1440" w:header="708" w:footer="708" w:gutter="0"/>
-          <w:pgNumType/>
-          <w:docGrid w:linePitch="360"/>
-        </w:sectPr>
-      </w:pPr>
-    </w:p>
     <w:p>
       <w:r>
         <w:br w:type="page"/>
@@ -15524,6 +16542,19 @@
       </w:tr>
     </w:tbl>
     <w:p>
+      <w:pPr>
+        <w:sectPr>
+          <w:headerReference w:type="default" r:id="rId27"/>
+          <w:footerReference w:type="default" r:id="rId28"/>
+          <w:type w:val="continuous"/>
+          <w:pgSz w:w="11906" w:h="16838" w:orient="portrait"/>
+          <w:pgMar w:top="1440" w:right="1440" w:bottom="1440" w:left="1440" w:header="708" w:footer="708" w:gutter="0"/>
+          <w:pgNumType/>
+          <w:docGrid w:linePitch="360"/>
+        </w:sectPr>
+      </w:pPr>
+    </w:p>
+    <w:p>
       <w:r>
         <w:br w:type="page"/>
       </w:r>
@@ -16365,9 +17396,387 @@
     </w:p>
     <w:p>
       <w:pPr>
+        <w:spacing w:after="120"/>
+      </w:pPr>
+      <w:r>
+        <w:rPr>
+          <w:rFonts w:ascii="Arial" w:cs="Arial" w:eastAsia="Arial" w:hAnsi="Arial"/>
+          <w:b/>
+          <w:bCs/>
+          <w:color w:val="E8604C"/>
+          <w:sz w:val="22"/>
+          <w:szCs w:val="22"/>
+        </w:rPr>
+        <w:t xml:space="preserve">✓ Website live im Internet</w:t>
+      </w:r>
+    </w:p>
+    <w:p>
+      <w:pPr>
+        <w:spacing w:after="120"/>
+      </w:pPr>
+      <w:r>
+        <w:rPr>
+          <w:rFonts w:ascii="Arial" w:cs="Arial" w:eastAsia="Arial" w:hAnsi="Arial"/>
+          <w:sz w:val="22"/>
+          <w:szCs w:val="22"/>
+        </w:rPr>
+        <w:t xml:space="preserve">Deine Website ist über GitHub und Vercel online. Jede Änderung, die du machst, ist in Sekunden live. Kostenlos.</w:t>
+      </w:r>
+    </w:p>
+    <w:p>
+      <w:pPr>
+        <w:spacing w:after="200"/>
+      </w:pPr>
+    </w:p>
+    <w:p>
+      <w:pPr>
+        <w:pBdr>
+          <w:bottom w:val="single" w:color="E8604C" w:sz="3"/>
+        </w:pBdr>
+        <w:spacing w:after="100"/>
+      </w:pPr>
+    </w:p>
+    <w:p>
+      <w:pPr>
+        <w:spacing w:after="200"/>
+      </w:pPr>
+    </w:p>
+    <w:p>
+      <w:pPr>
+        <w:spacing w:after="120"/>
+      </w:pPr>
+      <w:r>
+        <w:rPr>
+          <w:rFonts w:ascii="Arial" w:cs="Arial" w:eastAsia="Arial" w:hAnsi="Arial"/>
+          <w:b/>
+          <w:bCs/>
+          <w:sz w:val="22"/>
+          <w:szCs w:val="22"/>
+        </w:rPr>
+        <w:t xml:space="preserve">Was hat das alles gekostet?</w:t>
+      </w:r>
+    </w:p>
+    <w:p>
+      <w:pPr>
+        <w:spacing w:after="200"/>
+      </w:pPr>
+    </w:p>
+    <w:p>
+      <w:pPr>
+        <w:spacing w:after="120"/>
+      </w:pPr>
+      <w:r>
+        <w:rPr>
+          <w:rFonts w:ascii="Arial" w:cs="Arial" w:eastAsia="Arial" w:hAnsi="Arial"/>
+          <w:sz w:val="22"/>
+          <w:szCs w:val="22"/>
+        </w:rPr>
+        <w:t xml:space="preserve">Domain: ca. 1€/Monat (IONOS)</w:t>
+      </w:r>
+    </w:p>
+    <w:p>
+      <w:pPr>
+        <w:spacing w:after="120"/>
+      </w:pPr>
+      <w:r>
+        <w:rPr>
+          <w:rFonts w:ascii="Arial" w:cs="Arial" w:eastAsia="Arial" w:hAnsi="Arial"/>
+          <w:sz w:val="22"/>
+          <w:szCs w:val="22"/>
+        </w:rPr>
+        <w:t xml:space="preserve">Google Workspace: ca. 6€/Monat</w:t>
+      </w:r>
+    </w:p>
+    <w:p>
+      <w:pPr>
+        <w:spacing w:after="120"/>
+      </w:pPr>
+      <w:r>
+        <w:rPr>
+          <w:rFonts w:ascii="Arial" w:cs="Arial" w:eastAsia="Arial" w:hAnsi="Arial"/>
+          <w:sz w:val="22"/>
+          <w:szCs w:val="22"/>
+        </w:rPr>
+        <w:t xml:space="preserve">Claude AI Pro: ca. 20€/Monat</w:t>
+      </w:r>
+    </w:p>
+    <w:p>
+      <w:pPr>
+        <w:spacing w:after="120"/>
+      </w:pPr>
+      <w:r>
+        <w:rPr>
+          <w:rFonts w:ascii="Arial" w:cs="Arial" w:eastAsia="Arial" w:hAnsi="Arial"/>
+          <w:sz w:val="22"/>
+          <w:szCs w:val="22"/>
+        </w:rPr>
+        <w:t xml:space="preserve">Canva Free: 0€</w:t>
+      </w:r>
+    </w:p>
+    <w:p>
+      <w:pPr>
+        <w:spacing w:after="120"/>
+      </w:pPr>
+      <w:r>
+        <w:rPr>
+          <w:rFonts w:ascii="Arial" w:cs="Arial" w:eastAsia="Arial" w:hAnsi="Arial"/>
+          <w:sz w:val="22"/>
+          <w:szCs w:val="22"/>
+        </w:rPr>
+        <w:t xml:space="preserve">HubSpot Free: 0€</w:t>
+      </w:r>
+    </w:p>
+    <w:p>
+      <w:pPr>
+        <w:spacing w:after="120"/>
+      </w:pPr>
+      <w:r>
+        <w:rPr>
+          <w:rFonts w:ascii="Arial" w:cs="Arial" w:eastAsia="Arial" w:hAnsi="Arial"/>
+          <w:sz w:val="22"/>
+          <w:szCs w:val="22"/>
+        </w:rPr>
+        <w:t xml:space="preserve">GitHub: 0€</w:t>
+      </w:r>
+    </w:p>
+    <w:p>
+      <w:pPr>
+        <w:spacing w:after="120"/>
+      </w:pPr>
+      <w:r>
+        <w:rPr>
+          <w:rFonts w:ascii="Arial" w:cs="Arial" w:eastAsia="Arial" w:hAnsi="Arial"/>
+          <w:sz w:val="22"/>
+          <w:szCs w:val="22"/>
+        </w:rPr>
+        <w:t xml:space="preserve">Vercel: 0€</w:t>
+      </w:r>
+    </w:p>
+    <w:p>
+      <w:pPr>
+        <w:spacing w:after="120"/>
+      </w:pPr>
+      <w:r>
+        <w:rPr>
+          <w:rFonts w:ascii="Arial" w:cs="Arial" w:eastAsia="Arial" w:hAnsi="Arial"/>
+          <w:sz w:val="22"/>
+          <w:szCs w:val="22"/>
+        </w:rPr>
+        <w:t xml:space="preserve">Stripe: 0€ Grundgebühr (nur Transaktionsgebühren)</w:t>
+      </w:r>
+    </w:p>
+    <w:p>
+      <w:pPr>
+        <w:spacing w:after="200"/>
+      </w:pPr>
+    </w:p>
+    <w:p>
+      <w:pPr>
+        <w:spacing w:after="120"/>
+      </w:pPr>
+      <w:r>
+        <w:rPr>
+          <w:rFonts w:ascii="Arial" w:cs="Arial" w:eastAsia="Arial" w:hAnsi="Arial"/>
+          <w:b/>
+          <w:bCs/>
+          <w:color w:val="E8604C"/>
+          <w:sz w:val="22"/>
+          <w:szCs w:val="22"/>
+        </w:rPr>
+        <w:t xml:space="preserve">Gesamt: unter 30€ im Monat.</w:t>
+      </w:r>
+    </w:p>
+    <w:p>
+      <w:pPr>
+        <w:spacing w:after="200"/>
+      </w:pPr>
+    </w:p>
+    <w:p>
+      <w:pPr>
+        <w:spacing w:after="120"/>
+      </w:pPr>
+      <w:r>
+        <w:rPr>
+          <w:rFonts w:ascii="Arial" w:cs="Arial" w:eastAsia="Arial" w:hAnsi="Arial"/>
+          <w:sz w:val="22"/>
+          <w:szCs w:val="22"/>
+        </w:rPr>
+        <w:t xml:space="preserve">Zum Vergleich: Eine Agentur hätte für Website, Logo und Einrichtung allein 5.000–15.000€ genommen. Und du wärst abhängig von ihnen für jede kleine Änderung. Jetzt kannst du alles selbst. Jederzeit. Kostenlos.</w:t>
+      </w:r>
+    </w:p>
+    <w:p>
+      <w:pPr>
+        <w:spacing w:after="200"/>
+      </w:pPr>
+    </w:p>
+    <w:p>
+      <w:pPr>
+        <w:spacing w:after="120"/>
+      </w:pPr>
+      <w:r>
+        <w:rPr>
+          <w:rFonts w:ascii="Arial" w:cs="Arial" w:eastAsia="Arial" w:hAnsi="Arial"/>
+          <w:b/>
+          <w:bCs/>
+          <w:sz w:val="22"/>
+          <w:szCs w:val="22"/>
+        </w:rPr>
+        <w:t xml:space="preserve">Was du mit diesem Workbook gespart hast:</w:t>
+      </w:r>
+    </w:p>
+    <w:p>
+      <w:pPr>
+        <w:spacing w:after="120"/>
+      </w:pPr>
+      <w:r>
+        <w:rPr>
+          <w:rFonts w:ascii="Arial" w:cs="Arial" w:eastAsia="Arial" w:hAnsi="Arial"/>
+          <w:sz w:val="22"/>
+          <w:szCs w:val="22"/>
+        </w:rPr>
+        <w:t xml:space="preserve">Agentur-Website: 3.000–10.000€ — Du: 0€ (selbst gebaut mit Claude)</w:t>
+      </w:r>
+    </w:p>
+    <w:p>
+      <w:pPr>
+        <w:spacing w:after="120"/>
+      </w:pPr>
+      <w:r>
+        <w:rPr>
+          <w:rFonts w:ascii="Arial" w:cs="Arial" w:eastAsia="Arial" w:hAnsi="Arial"/>
+          <w:sz w:val="22"/>
+          <w:szCs w:val="22"/>
+        </w:rPr>
+        <w:t xml:space="preserve">Logo &amp; Branding: 500–2.000€ — Du: 0€ (Canva)</w:t>
+      </w:r>
+    </w:p>
+    <w:p>
+      <w:pPr>
+        <w:spacing w:after="120"/>
+      </w:pPr>
+      <w:r>
+        <w:rPr>
+          <w:rFonts w:ascii="Arial" w:cs="Arial" w:eastAsia="Arial" w:hAnsi="Arial"/>
+          <w:sz w:val="22"/>
+          <w:szCs w:val="22"/>
+        </w:rPr>
+        <w:t xml:space="preserve">Rechtliche Texte: 300–1.500€ — Du: 0€ (Generatoren + Claude)</w:t>
+      </w:r>
+    </w:p>
+    <w:p>
+      <w:pPr>
+        <w:spacing w:after="120"/>
+      </w:pPr>
+      <w:r>
+        <w:rPr>
+          <w:rFonts w:ascii="Arial" w:cs="Arial" w:eastAsia="Arial" w:hAnsi="Arial"/>
+          <w:sz w:val="22"/>
+          <w:szCs w:val="22"/>
+        </w:rPr>
+        <w:t xml:space="preserve">CRM-Einrichtung: 500–2.000€ — Du: 0€ (HubSpot Free + Claude)</w:t>
+      </w:r>
+    </w:p>
+    <w:p>
+      <w:pPr>
+        <w:spacing w:after="120"/>
+      </w:pPr>
+      <w:r>
+        <w:rPr>
+          <w:rFonts w:ascii="Arial" w:cs="Arial" w:eastAsia="Arial" w:hAnsi="Arial"/>
+          <w:sz w:val="22"/>
+          <w:szCs w:val="22"/>
+        </w:rPr>
+        <w:t xml:space="preserve">E-Mail-Signatur &amp; Automatisierung: 200–500€ — Du: 0€ (Claude)</w:t>
+      </w:r>
+    </w:p>
+    <w:p>
+      <w:pPr>
+        <w:spacing w:after="120"/>
+      </w:pPr>
+      <w:r>
+        <w:rPr>
+          <w:rFonts w:ascii="Arial" w:cs="Arial" w:eastAsia="Arial" w:hAnsi="Arial"/>
+          <w:sz w:val="22"/>
+          <w:szCs w:val="22"/>
+        </w:rPr>
+        <w:t xml:space="preserve">Digitaler Verkauf (Stripe-Einrichtung): 300–1.000€ — Du: 0€ (Claude)</w:t>
+      </w:r>
+    </w:p>
+    <w:p>
+      <w:pPr>
+        <w:spacing w:after="200"/>
+      </w:pPr>
+    </w:p>
+    <w:p>
+      <w:pPr>
+        <w:spacing w:after="120"/>
+      </w:pPr>
+      <w:r>
+        <w:rPr>
+          <w:rFonts w:ascii="Arial" w:cs="Arial" w:eastAsia="Arial" w:hAnsi="Arial"/>
+          <w:b/>
+          <w:bCs/>
+          <w:color w:val="E8604C"/>
+          <w:sz w:val="22"/>
+          <w:szCs w:val="22"/>
+        </w:rPr>
+        <w:t xml:space="preserve">Ersparnis: zwischen 5.000 und 15.000€. Für 89€.</w:t>
+      </w:r>
+    </w:p>
+    <w:p>
+      <w:pPr>
+        <w:spacing w:after="120"/>
+      </w:pPr>
+      <w:r>
+        <w:rPr>
+          <w:rFonts w:ascii="Arial" w:cs="Arial" w:eastAsia="Arial" w:hAnsi="Arial"/>
+          <w:sz w:val="22"/>
+          <w:szCs w:val="22"/>
+        </w:rPr>
+        <w:t xml:space="preserve">Das ist weniger als eine einzige Stunde bei einer Agentur. Und du bekommst dafür deinen kompletten Business Workspace — 120+ Seiten, alle Prompts, Schritt für Schritt.</w:t>
+      </w:r>
+    </w:p>
+    <w:p>
+      <w:pPr>
+        <w:spacing w:after="200"/>
+      </w:pPr>
+    </w:p>
+    <w:p>
+      <w:pPr>
+        <w:spacing w:after="120"/>
+      </w:pPr>
+      <w:r>
+        <w:rPr>
+          <w:rFonts w:ascii="Arial" w:cs="Arial" w:eastAsia="Arial" w:hAnsi="Arial"/>
+          <w:sz w:val="22"/>
+          <w:szCs w:val="22"/>
+        </w:rPr>
+        <w:t xml:space="preserve">Und das Beste: Du bist jetzt unabhängig. Du verstehst, wie alles funktioniert. Du kannst jederzeit Änderungen vornehmen, neue Seiten erstellen, Texte anpassen — ohne jemanden dafür bezahlen zu müssen.</w:t>
+      </w:r>
+    </w:p>
+    <w:p>
+      <w:pPr>
+        <w:spacing w:after="200"/>
+      </w:pPr>
+    </w:p>
+    <w:p>
+      <w:pPr>
+        <w:pBdr>
+          <w:bottom w:val="single" w:color="E8604C" w:sz="3"/>
+        </w:pBdr>
+        <w:spacing w:after="100"/>
+      </w:pPr>
+    </w:p>
+    <w:p>
+      <w:pPr>
+        <w:spacing w:after="200"/>
+      </w:pPr>
+    </w:p>
+    <w:p>
+      <w:pPr>
         <w:sectPr>
-          <w:headerReference w:type="default" r:id="rId27"/>
-          <w:footerReference w:type="default" r:id="rId28"/>
+          <w:headerReference w:type="default" r:id="rId29"/>
+          <w:footerReference w:type="default" r:id="rId30"/>
           <w:type w:val="continuous"/>
           <w:pgSz w:w="11906" w:h="16838" w:orient="portrait"/>
           <w:pgMar w:top="1440" w:right="1440" w:bottom="1440" w:left="1440" w:header="708" w:footer="708" w:gutter="0"/>
@@ -16385,24 +17794,48 @@
           <w:rFonts w:ascii="Arial" w:cs="Arial" w:eastAsia="Arial" w:hAnsi="Arial"/>
           <w:b/>
           <w:bCs/>
-          <w:color w:val="E8604C"/>
-          <w:sz w:val="22"/>
-          <w:szCs w:val="22"/>
-        </w:rPr>
-        <w:t xml:space="preserve">✓ Website live im Internet</w:t>
-      </w:r>
-    </w:p>
-    <w:p>
-      <w:pPr>
-        <w:spacing w:after="120"/>
-      </w:pPr>
-      <w:r>
-        <w:rPr>
-          <w:rFonts w:ascii="Arial" w:cs="Arial" w:eastAsia="Arial" w:hAnsi="Arial"/>
-          <w:sz w:val="22"/>
-          <w:szCs w:val="22"/>
-        </w:rPr>
-        <w:t xml:space="preserve">Deine Website ist über GitHub und Vercel online. Jede Änderung, die du machst, ist in Sekunden live. Kostenlos.</w:t>
+          <w:sz w:val="22"/>
+          <w:szCs w:val="22"/>
+        </w:rPr>
+        <w:t xml:space="preserve">So macht Selbstständigkeit wieder Spaß.</w:t>
+      </w:r>
+    </w:p>
+    <w:p>
+      <w:pPr>
+        <w:spacing w:after="200"/>
+      </w:pPr>
+    </w:p>
+    <w:p>
+      <w:pPr>
+        <w:spacing w:after="120"/>
+      </w:pPr>
+      <w:r>
+        <w:rPr>
+          <w:rFonts w:ascii="Arial" w:cs="Arial" w:eastAsia="Arial" w:hAnsi="Arial"/>
+          <w:sz w:val="22"/>
+          <w:szCs w:val="22"/>
+        </w:rPr>
+        <w:t xml:space="preserve">Du hast bewiesen, dass du alles selbst aufbauen kannst. Nicht weil du Technik verstehst — sondern weil du eine KI hast, die Technik für dich versteht. Das ist die Zukunft. Und du bist schon da.</w:t>
+      </w:r>
+    </w:p>
+    <w:p>
+      <w:pPr>
+        <w:spacing w:after="200"/>
+      </w:pPr>
+    </w:p>
+    <w:p>
+      <w:pPr>
+        <w:spacing w:after="120"/>
+      </w:pPr>
+      <w:r>
+        <w:rPr>
+          <w:rFonts w:ascii="Arial" w:cs="Arial" w:eastAsia="Arial" w:hAnsi="Arial"/>
+          <w:i/>
+          <w:iCs/>
+          <w:sz w:val="22"/>
+          <w:szCs w:val="22"/>
+        </w:rPr>
+        <w:t xml:space="preserve">Ich habe meinen eigenen Business Workspace genauso aufgebaut — 1:1 mit den gleichen Schritten und Prompts, die du in diesem Workbook findest. Das hier ist kein theoretisches Wissen. Das ist mein Weg. Und jetzt ist es deiner.</w:t>
       </w:r>
     </w:p>
     <w:p>
@@ -16435,155 +17868,71 @@
           <w:sz w:val="22"/>
           <w:szCs w:val="22"/>
         </w:rPr>
-        <w:t xml:space="preserve">Was hat das alles gekostet?</w:t>
-      </w:r>
-    </w:p>
-    <w:p>
-      <w:pPr>
-        <w:spacing w:after="200"/>
-      </w:pPr>
-    </w:p>
-    <w:p>
-      <w:pPr>
-        <w:spacing w:after="120"/>
-      </w:pPr>
-      <w:r>
-        <w:rPr>
-          <w:rFonts w:ascii="Arial" w:cs="Arial" w:eastAsia="Arial" w:hAnsi="Arial"/>
-          <w:sz w:val="22"/>
-          <w:szCs w:val="22"/>
-        </w:rPr>
-        <w:t xml:space="preserve">Domain: ca. 1€/Monat (IONOS)</w:t>
-      </w:r>
-    </w:p>
-    <w:p>
-      <w:pPr>
-        <w:spacing w:after="120"/>
-      </w:pPr>
-      <w:r>
-        <w:rPr>
-          <w:rFonts w:ascii="Arial" w:cs="Arial" w:eastAsia="Arial" w:hAnsi="Arial"/>
-          <w:sz w:val="22"/>
-          <w:szCs w:val="22"/>
-        </w:rPr>
-        <w:t xml:space="preserve">Google Workspace: ca. 6€/Monat</w:t>
-      </w:r>
-    </w:p>
-    <w:p>
-      <w:pPr>
-        <w:spacing w:after="120"/>
-      </w:pPr>
-      <w:r>
-        <w:rPr>
-          <w:rFonts w:ascii="Arial" w:cs="Arial" w:eastAsia="Arial" w:hAnsi="Arial"/>
-          <w:sz w:val="22"/>
-          <w:szCs w:val="22"/>
-        </w:rPr>
-        <w:t xml:space="preserve">Claude AI Pro: ca. 20€/Monat</w:t>
-      </w:r>
-    </w:p>
-    <w:p>
-      <w:pPr>
-        <w:spacing w:after="120"/>
-      </w:pPr>
-      <w:r>
-        <w:rPr>
-          <w:rFonts w:ascii="Arial" w:cs="Arial" w:eastAsia="Arial" w:hAnsi="Arial"/>
-          <w:sz w:val="22"/>
-          <w:szCs w:val="22"/>
-        </w:rPr>
-        <w:t xml:space="preserve">Canva Free: 0€</w:t>
-      </w:r>
-    </w:p>
-    <w:p>
-      <w:pPr>
-        <w:spacing w:after="120"/>
-      </w:pPr>
-      <w:r>
-        <w:rPr>
-          <w:rFonts w:ascii="Arial" w:cs="Arial" w:eastAsia="Arial" w:hAnsi="Arial"/>
-          <w:sz w:val="22"/>
-          <w:szCs w:val="22"/>
-        </w:rPr>
-        <w:t xml:space="preserve">HubSpot Free: 0€</w:t>
-      </w:r>
-    </w:p>
-    <w:p>
-      <w:pPr>
-        <w:spacing w:after="120"/>
-      </w:pPr>
-      <w:r>
-        <w:rPr>
-          <w:rFonts w:ascii="Arial" w:cs="Arial" w:eastAsia="Arial" w:hAnsi="Arial"/>
-          <w:sz w:val="22"/>
-          <w:szCs w:val="22"/>
-        </w:rPr>
-        <w:t xml:space="preserve">GitHub: 0€</w:t>
-      </w:r>
-    </w:p>
-    <w:p>
-      <w:pPr>
-        <w:spacing w:after="120"/>
-      </w:pPr>
-      <w:r>
-        <w:rPr>
-          <w:rFonts w:ascii="Arial" w:cs="Arial" w:eastAsia="Arial" w:hAnsi="Arial"/>
-          <w:sz w:val="22"/>
-          <w:szCs w:val="22"/>
-        </w:rPr>
-        <w:t xml:space="preserve">Vercel: 0€</w:t>
-      </w:r>
-    </w:p>
-    <w:p>
-      <w:pPr>
-        <w:spacing w:after="120"/>
-      </w:pPr>
-      <w:r>
-        <w:rPr>
-          <w:rFonts w:ascii="Arial" w:cs="Arial" w:eastAsia="Arial" w:hAnsi="Arial"/>
-          <w:sz w:val="22"/>
-          <w:szCs w:val="22"/>
-        </w:rPr>
-        <w:t xml:space="preserve">Stripe: 0€ Grundgebühr (nur Transaktionsgebühren)</w:t>
-      </w:r>
-    </w:p>
-    <w:p>
-      <w:pPr>
-        <w:spacing w:after="200"/>
-      </w:pPr>
-    </w:p>
-    <w:p>
-      <w:pPr>
-        <w:spacing w:after="120"/>
-      </w:pPr>
-      <w:r>
-        <w:rPr>
-          <w:rFonts w:ascii="Arial" w:cs="Arial" w:eastAsia="Arial" w:hAnsi="Arial"/>
-          <w:b/>
-          <w:bCs/>
-          <w:color w:val="E8604C"/>
-          <w:sz w:val="22"/>
-          <w:szCs w:val="22"/>
-        </w:rPr>
-        <w:t xml:space="preserve">Gesamt: unter 30€ im Monat.</w:t>
-      </w:r>
-    </w:p>
-    <w:p>
-      <w:pPr>
-        <w:spacing w:after="200"/>
-      </w:pPr>
-    </w:p>
-    <w:p>
-      <w:pPr>
-        <w:spacing w:after="120"/>
-      </w:pPr>
-      <w:r>
-        <w:rPr>
-          <w:rFonts w:ascii="Arial" w:cs="Arial" w:eastAsia="Arial" w:hAnsi="Arial"/>
-          <w:sz w:val="22"/>
-          <w:szCs w:val="22"/>
-        </w:rPr>
-        <w:t xml:space="preserve">Zum Vergleich: Eine Agentur hätte für Website, Logo und Einrichtung allein 5.000–15.000€ genommen. Und du wärst abhängig von ihnen für jede kleine Änderung. Jetzt kannst du alles selbst. Jederzeit. Kostenlos.</w:t>
+        <w:t xml:space="preserve">Dein Feedback ist willkommen!</w:t>
+      </w:r>
+    </w:p>
+    <w:p>
+      <w:pPr>
+        <w:spacing w:after="200"/>
+      </w:pPr>
+    </w:p>
+    <w:p>
+      <w:pPr>
+        <w:spacing w:after="120"/>
+      </w:pPr>
+      <w:r>
+        <w:rPr>
+          <w:rFonts w:ascii="Arial" w:cs="Arial" w:eastAsia="Arial" w:hAnsi="Arial"/>
+          <w:sz w:val="22"/>
+          <w:szCs w:val="22"/>
+        </w:rPr>
+        <w:t xml:space="preserve">Hast du Ideen, Tipps, Verbesserungsvorschläge oder Fragen? Ich freue mich über jede Rückmeldung — egal ob Lob, Kritik oder eine Idee für ein neues Kapitel. Dieses Workbook lebt und wird weiterentwickelt.</w:t>
+      </w:r>
+    </w:p>
+    <w:p>
+      <w:pPr>
+        <w:spacing w:after="200"/>
+      </w:pPr>
+    </w:p>
+    <w:p>
+      <w:pPr>
+        <w:spacing w:after="120"/>
+      </w:pPr>
+      <w:r>
+        <w:rPr>
+          <w:rFonts w:ascii="Arial" w:cs="Arial" w:eastAsia="Arial" w:hAnsi="Arial"/>
+          <w:sz w:val="22"/>
+          <w:szCs w:val="22"/>
+        </w:rPr>
+        <w:t xml:space="preserve">Schreib mir einfach:</w:t>
+      </w:r>
+    </w:p>
+    <w:p>
+      <w:pPr>
+        <w:spacing w:after="120"/>
+      </w:pPr>
+      <w:r>
+        <w:rPr>
+          <w:rFonts w:ascii="Arial" w:cs="Arial" w:eastAsia="Arial" w:hAnsi="Arial"/>
+          <w:b/>
+          <w:bCs/>
+          <w:sz w:val="22"/>
+          <w:szCs w:val="22"/>
+        </w:rPr>
+        <w:t xml:space="preserve">E-Mail: kontakt@baeumlermarketing.de</w:t>
+      </w:r>
+    </w:p>
+    <w:p>
+      <w:pPr>
+        <w:spacing w:after="120"/>
+      </w:pPr>
+      <w:r>
+        <w:rPr>
+          <w:rFonts w:ascii="Arial" w:cs="Arial" w:eastAsia="Arial" w:hAnsi="Arial"/>
+          <w:sz w:val="22"/>
+          <w:szCs w:val="22"/>
+        </w:rPr>
+        <w:t xml:space="preserve">Website: baeumlermarketing.de</w:t>
       </w:r>
     </w:p>
     <w:p>
@@ -16611,48 +17960,10 @@
       <w:r>
         <w:rPr>
           <w:rFonts w:ascii="Arial" w:cs="Arial" w:eastAsia="Arial" w:hAnsi="Arial"/>
-          <w:b/>
-          <w:bCs/>
-          <w:sz w:val="22"/>
-          <w:szCs w:val="22"/>
-        </w:rPr>
-        <w:t xml:space="preserve">So macht Selbstständigkeit wieder Spaß.</w:t>
-      </w:r>
-    </w:p>
-    <w:p>
-      <w:pPr>
-        <w:spacing w:after="200"/>
-      </w:pPr>
-    </w:p>
-    <w:p>
-      <w:pPr>
-        <w:spacing w:after="120"/>
-      </w:pPr>
-      <w:r>
-        <w:rPr>
-          <w:rFonts w:ascii="Arial" w:cs="Arial" w:eastAsia="Arial" w:hAnsi="Arial"/>
-          <w:sz w:val="22"/>
-          <w:szCs w:val="22"/>
-        </w:rPr>
-        <w:t xml:space="preserve">Du hast bewiesen, dass du alles selbst aufbauen kannst. Nicht weil du Technik verstehst — sondern weil du eine KI hast, die Technik für dich versteht. Das ist die Zukunft. Und du bist schon da.</w:t>
-      </w:r>
-    </w:p>
-    <w:p>
-      <w:pPr>
-        <w:spacing w:after="200"/>
-      </w:pPr>
-    </w:p>
-    <w:p>
-      <w:pPr>
-        <w:spacing w:after="120"/>
-      </w:pPr>
-      <w:r>
-        <w:rPr>
-          <w:rFonts w:ascii="Arial" w:cs="Arial" w:eastAsia="Arial" w:hAnsi="Arial"/>
-          <w:sz w:val="22"/>
-          <w:szCs w:val="22"/>
-        </w:rPr>
-        <w:t xml:space="preserve">Wenn du bereit bist für den nächsten Schritt — Marketing, Social Media, SEO, Analytics, Terminbuchung und mehr — dann wartet Workbook 2 auf dich.</w:t>
+          <w:sz w:val="22"/>
+          <w:szCs w:val="22"/>
+        </w:rPr>
+        <w:t xml:space="preserve">Wenn du bereit bist für den nächsten Schritt — Marketing, Social Media, Content-Strategie, Analytics, Terminbuchung und mehr — dann wartet Workbook 2 auf dich.</w:t>
       </w:r>
     </w:p>
     <w:p>
@@ -16707,8 +18018,8 @@
       </w:r>
     </w:p>
     <w:sectPr>
-      <w:headerReference w:type="default" r:id="rId29"/>
-      <w:footerReference w:type="default" r:id="rId30"/>
+      <w:headerReference w:type="default" r:id="rId31"/>
+      <w:footerReference w:type="default" r:id="rId32"/>
       <w:type w:val="continuous"/>
       <w:pgSz w:w="11906" w:h="16838" w:orient="portrait"/>
       <w:pgMar w:top="1440" w:right="1440" w:bottom="1440" w:left="1440" w:header="708" w:footer="708" w:gutter="0"/>
@@ -16854,6 +18165,37 @@
 </file>
 
 <file path=word/footer12.xml><?xml version="1.0" encoding="utf-8"?>
+<w:ftr xmlns:wpc="http://schemas.microsoft.com/office/word/2010/wordprocessingCanvas" xmlns:mc="http://schemas.openxmlformats.org/markup-compatibility/2006" xmlns:o="urn:schemas-microsoft-com:office:office" xmlns:r="http://schemas.openxmlformats.org/officeDocument/2006/relationships" xmlns:m="http://schemas.openxmlformats.org/officeDocument/2006/math" xmlns:v="urn:schemas-microsoft-com:vml" xmlns:wp14="http://schemas.microsoft.com/office/word/2010/wordprocessingDrawing" xmlns:wp="http://schemas.openxmlformats.org/drawingml/2006/wordprocessingDrawing" xmlns:w10="urn:schemas-microsoft-com:office:word" xmlns:w="http://schemas.openxmlformats.org/wordprocessingml/2006/main" xmlns:w14="http://schemas.microsoft.com/office/word/2010/wordml" xmlns:w15="http://schemas.microsoft.com/office/word/2012/wordml" xmlns:wpg="http://schemas.microsoft.com/office/word/2010/wordprocessingGroup" xmlns:wpi="http://schemas.microsoft.com/office/word/2010/wordprocessingInk" xmlns:wne="http://schemas.microsoft.com/office/word/2006/wordml" xmlns:wps="http://schemas.microsoft.com/office/word/2010/wordprocessingShape">
+  <w:p>
+    <w:pPr>
+      <w:jc w:val="center"/>
+    </w:pPr>
+    <w:r>
+      <w:rPr>
+        <w:rFonts w:ascii="Arial" w:cs="Arial" w:eastAsia="Arial" w:hAnsi="Arial"/>
+        <w:color w:val="AAAAAA"/>
+        <w:sz w:val="16"/>
+        <w:szCs w:val="16"/>
+      </w:rPr>
+      <w:t xml:space="preserve">Seite </w:t>
+    </w:r>
+    <w:r>
+      <w:rPr>
+        <w:rFonts w:ascii="Arial" w:cs="Arial" w:eastAsia="Arial" w:hAnsi="Arial"/>
+        <w:color w:val="AAAAAA"/>
+        <w:sz w:val="16"/>
+        <w:szCs w:val="16"/>
+      </w:rPr>
+      <w:fldChar w:fldCharType="begin"/>
+      <w:instrText xml:space="preserve">PAGE</w:instrText>
+      <w:fldChar w:fldCharType="separate"/>
+      <w:fldChar w:fldCharType="end"/>
+    </w:r>
+  </w:p>
+</w:ftr>
+</file>
+
+<file path=word/footer13.xml><?xml version="1.0" encoding="utf-8"?>
 <w:ftr xmlns:wpc="http://schemas.microsoft.com/office/word/2010/wordprocessingCanvas" xmlns:mc="http://schemas.openxmlformats.org/markup-compatibility/2006" xmlns:o="urn:schemas-microsoft-com:office:office" xmlns:r="http://schemas.openxmlformats.org/officeDocument/2006/relationships" xmlns:m="http://schemas.openxmlformats.org/officeDocument/2006/math" xmlns:v="urn:schemas-microsoft-com:vml" xmlns:wp14="http://schemas.microsoft.com/office/word/2010/wordprocessingDrawing" xmlns:wp="http://schemas.openxmlformats.org/drawingml/2006/wordprocessingDrawing" xmlns:w10="urn:schemas-microsoft-com:office:word" xmlns:w="http://schemas.openxmlformats.org/wordprocessingml/2006/main" xmlns:w14="http://schemas.microsoft.com/office/word/2010/wordml" xmlns:w15="http://schemas.microsoft.com/office/word/2012/wordml" xmlns:wpg="http://schemas.microsoft.com/office/word/2010/wordprocessingGroup" xmlns:wpi="http://schemas.microsoft.com/office/word/2010/wordprocessingInk" xmlns:wne="http://schemas.microsoft.com/office/word/2006/wordml" xmlns:wps="http://schemas.microsoft.com/office/word/2010/wordprocessingShape">
   <w:p>
     <w:pPr>
@@ -17245,6 +18587,25 @@
 </w:hdr>
 </file>
 
+<file path=word/header13.xml><?xml version="1.0" encoding="utf-8"?>
+<w:hdr xmlns:wpc="http://schemas.microsoft.com/office/word/2010/wordprocessingCanvas" xmlns:mc="http://schemas.openxmlformats.org/markup-compatibility/2006" xmlns:o="urn:schemas-microsoft-com:office:office" xmlns:r="http://schemas.openxmlformats.org/officeDocument/2006/relationships" xmlns:m="http://schemas.openxmlformats.org/officeDocument/2006/math" xmlns:v="urn:schemas-microsoft-com:vml" xmlns:wp14="http://schemas.microsoft.com/office/word/2010/wordprocessingDrawing" xmlns:wp="http://schemas.openxmlformats.org/drawingml/2006/wordprocessingDrawing" xmlns:w10="urn:schemas-microsoft-com:office:word" xmlns:w="http://schemas.openxmlformats.org/wordprocessingml/2006/main" xmlns:w14="http://schemas.microsoft.com/office/word/2010/wordml" xmlns:w15="http://schemas.microsoft.com/office/word/2012/wordml" xmlns:wpg="http://schemas.microsoft.com/office/word/2010/wordprocessingGroup" xmlns:wpi="http://schemas.microsoft.com/office/word/2010/wordprocessingInk" xmlns:wne="http://schemas.microsoft.com/office/word/2006/wordml" xmlns:wps="http://schemas.microsoft.com/office/word/2010/wordprocessingShape" xmlns:cx="http://schemas.microsoft.com/office/drawing/2014/chartex" xmlns:cx1="http://schemas.microsoft.com/office/drawing/2015/9/8/chartex" xmlns:cx2="http://schemas.microsoft.com/office/drawing/2015/10/21/chartex" xmlns:cx3="http://schemas.microsoft.com/office/drawing/2016/5/9/chartex" xmlns:cx4="http://schemas.microsoft.com/office/drawing/2016/5/10/chartex" xmlns:cx5="http://schemas.microsoft.com/office/drawing/2016/5/11/chartex" xmlns:cx6="http://schemas.microsoft.com/office/drawing/2016/5/12/chartex" xmlns:cx7="http://schemas.microsoft.com/office/drawing/2016/5/13/chartex" xmlns:cx8="http://schemas.microsoft.com/office/drawing/2016/5/14/chartex" xmlns:w16cid="http://schemas.microsoft.com/office/word/2016/wordml/cid" xmlns:w16se="http://schemas.microsoft.com/office/word/2015/wordml/symex">
+  <w:p>
+    <w:pPr>
+      <w:jc w:val="right"/>
+    </w:pPr>
+    <w:r>
+      <w:rPr>
+        <w:rFonts w:ascii="Arial" w:cs="Arial" w:eastAsia="Arial" w:hAnsi="Arial"/>
+        <w:color w:val="AAAAAA"/>
+        <w:sz w:val="16"/>
+        <w:szCs w:val="16"/>
+      </w:rPr>
+      <w:t xml:space="preserve">Baeumler Marketing · Selbstständig online in unter einer Woche</w:t>
+    </w:r>
+  </w:p>
+</w:hdr>
+</file>
+
 <file path=word/header2.xml><?xml version="1.0" encoding="utf-8"?>
 <w:hdr xmlns:wpc="http://schemas.microsoft.com/office/word/2010/wordprocessingCanvas" xmlns:mc="http://schemas.openxmlformats.org/markup-compatibility/2006" xmlns:o="urn:schemas-microsoft-com:office:office" xmlns:r="http://schemas.openxmlformats.org/officeDocument/2006/relationships" xmlns:m="http://schemas.openxmlformats.org/officeDocument/2006/math" xmlns:v="urn:schemas-microsoft-com:vml" xmlns:wp14="http://schemas.microsoft.com/office/word/2010/wordprocessingDrawing" xmlns:wp="http://schemas.openxmlformats.org/drawingml/2006/wordprocessingDrawing" xmlns:w10="urn:schemas-microsoft-com:office:word" xmlns:w="http://schemas.openxmlformats.org/wordprocessingml/2006/main" xmlns:w14="http://schemas.microsoft.com/office/word/2010/wordml" xmlns:w15="http://schemas.microsoft.com/office/word/2012/wordml" xmlns:wpg="http://schemas.microsoft.com/office/word/2010/wordprocessingGroup" xmlns:wpi="http://schemas.microsoft.com/office/word/2010/wordprocessingInk" xmlns:wne="http://schemas.microsoft.com/office/word/2006/wordml" xmlns:wps="http://schemas.microsoft.com/office/word/2010/wordprocessingShape" xmlns:cx="http://schemas.microsoft.com/office/drawing/2014/chartex" xmlns:cx1="http://schemas.microsoft.com/office/drawing/2015/9/8/chartex" xmlns:cx2="http://schemas.microsoft.com/office/drawing/2015/10/21/chartex" xmlns:cx3="http://schemas.microsoft.com/office/drawing/2016/5/9/chartex" xmlns:cx4="http://schemas.microsoft.com/office/drawing/2016/5/10/chartex" xmlns:cx5="http://schemas.microsoft.com/office/drawing/2016/5/11/chartex" xmlns:cx6="http://schemas.microsoft.com/office/drawing/2016/5/12/chartex" xmlns:cx7="http://schemas.microsoft.com/office/drawing/2016/5/13/chartex" xmlns:cx8="http://schemas.microsoft.com/office/drawing/2016/5/14/chartex" xmlns:w16cid="http://schemas.microsoft.com/office/word/2016/wordml/cid" xmlns:w16se="http://schemas.microsoft.com/office/word/2015/wordml/symex">
   <w:p>

</xml_diff>